<commit_message>
update to use IEEE format
</commit_message>
<xml_diff>
--- a/propuesta.docx
+++ b/propuesta.docx
@@ -138,39 +138,7 @@
           <w:sz w:val="44"/>
           <w:szCs w:val="44"/>
         </w:rPr>
-        <w:t xml:space="preserve">Propuesta de Trabajo Final de Grado Comparativa OCSVM vs enfoques multi-etiqueta en </w:t>
-      </w:r>
-      <w:r>
-        <w:rPr>
-          <w:rFonts w:ascii="Arial" w:hAnsi="Arial" w:cs="Arial"/>
-          <w:sz w:val="44"/>
-          <w:szCs w:val="44"/>
-        </w:rPr>
-        <w:t>tráfico</w:t>
-      </w:r>
-      <w:r>
-        <w:rPr>
-          <w:rFonts w:ascii="Arial" w:hAnsi="Arial" w:cs="Arial"/>
-          <w:sz w:val="44"/>
-          <w:szCs w:val="44"/>
-        </w:rPr>
-        <w:t xml:space="preserve"> HTTP real: </w:t>
-      </w:r>
-      <w:r>
-        <w:rPr>
-          <w:rFonts w:ascii="Arial" w:hAnsi="Arial" w:cs="Arial"/>
-          <w:sz w:val="44"/>
-          <w:szCs w:val="44"/>
-        </w:rPr>
-        <w:t>integración</w:t>
-      </w:r>
-      <w:r>
-        <w:rPr>
-          <w:rFonts w:ascii="Arial" w:hAnsi="Arial" w:cs="Arial"/>
-          <w:sz w:val="44"/>
-          <w:szCs w:val="44"/>
-        </w:rPr>
-        <w:t xml:space="preserve"> de SR-BH 2020 y enriquecimiento de features</w:t>
+        <w:t>Propuesta de Trabajo Final de Grado Comparativa OCSVM vs enfoques multi-etiqueta en tráfico HTTP real: integración de SR-BH 2020 y enriquecimiento de features</w:t>
       </w:r>
     </w:p>
     <w:p>
@@ -354,15 +322,7 @@
           <w:sz w:val="44"/>
           <w:szCs w:val="44"/>
         </w:rPr>
-        <w:t>Año de ingreso: 2021</w:t>
-      </w:r>
-      <w:r>
-        <w:rPr>
-          <w:rFonts w:ascii="Arial" w:hAnsi="Arial" w:cs="Arial"/>
-          <w:sz w:val="44"/>
-          <w:szCs w:val="44"/>
-        </w:rPr>
-        <w:t>-2025</w:t>
+        <w:t>Año de ingreso: 2021-2025</w:t>
       </w:r>
     </w:p>
     <w:p>
@@ -470,7 +430,7 @@
         <w:rPr>
           <w:rFonts w:ascii="Arial" w:hAnsi="Arial" w:cs="Arial"/>
         </w:rPr>
-        <w:t>Las aplicaciones web han tenido un crecimiento constante en la última década, convirtiéndose en infraestructuras críticas para servicios de comercio, comunicación y administración. Sin embargo, al estar expuestas a través de la red, siguen siendo objetivo de una amplia variedad de ataques dirigidos al protocolo HTTP (Hypertext Transfer Protocol), tales como inyecciones, cross-site scripting y ataques de traversal [GP5]. En muchos casos, las aplicaciones no implementan las mejores prácticas de seguridad, o bien priorizan la incorporación de funcionalidades por encima de la robustez y los controles, exponiendo la infraestructura a riesgos potenciales de pérdida de datos, interrupción del servicio y brechas de seguridad.</w:t>
+        <w:t>Las aplicaciones web han tenido un crecimiento constante en la última década, convirtiéndose en infraestructuras críticas para servicios de comercio, comunicación y administración. Sin embargo, al estar expuestas a través de la red, siguen siendo objetivo de una amplia variedad de ataques dirigidos al protocolo HTTP (Hypertext Transfer Protocol), tales como inyecciones, cross-site scripting y ataques de traversal [1]. En muchos casos, las aplicaciones no implementan las mejores prácticas de seguridad, o bien priorizan la incorporación de funcionalidades por encima de la robustez y los controles, exponiendo la infraestructura a riesgos potenciales de pérdida de datos, interrupción del servicio y brechas de seguridad.</w:t>
       </w:r>
     </w:p>
     <w:p>
@@ -485,77 +445,7 @@
         <w:rPr>
           <w:rFonts w:ascii="Arial" w:hAnsi="Arial" w:cs="Arial"/>
         </w:rPr>
-        <w:t xml:space="preserve">En este contexto, los sistemas de detección y prevención de intrusiones (IDS – Intrusion Detection System, IPS – Intrusion Prevention System) y, particularmente, los cortafuegos para aplicaciones web (WAF – Web </w:t>
-      </w:r>
-      <w:proofErr w:type="spellStart"/>
-      <w:r>
-        <w:rPr>
-          <w:rFonts w:ascii="Arial" w:hAnsi="Arial" w:cs="Arial"/>
-        </w:rPr>
-        <w:t>Application</w:t>
-      </w:r>
-      <w:proofErr w:type="spellEnd"/>
-      <w:r>
-        <w:rPr>
-          <w:rFonts w:ascii="Arial" w:hAnsi="Arial" w:cs="Arial"/>
-        </w:rPr>
-        <w:t xml:space="preserve"> Firewall), juegan un rol fundamental para identificar y mitigar ataques en tiempo real. El uso de técnicas de aprendizaje de máquinas (ML – Machine </w:t>
-      </w:r>
-      <w:proofErr w:type="spellStart"/>
-      <w:r>
-        <w:rPr>
-          <w:rFonts w:ascii="Arial" w:hAnsi="Arial" w:cs="Arial"/>
-        </w:rPr>
-        <w:t>Learning</w:t>
-      </w:r>
-      <w:proofErr w:type="spellEnd"/>
-      <w:r>
-        <w:rPr>
-          <w:rFonts w:ascii="Arial" w:hAnsi="Arial" w:cs="Arial"/>
-        </w:rPr>
-        <w:t xml:space="preserve">) permite mejorar la detección de comportamientos anómalos y descubrir patrones emergentes que no están cubiertos por reglas estáticas [BG16, KV03, N+11]. En particular, los enfoques de clasificación de una sola clase (OCC – </w:t>
-      </w:r>
-      <w:proofErr w:type="spellStart"/>
-      <w:r>
-        <w:rPr>
-          <w:rFonts w:ascii="Arial" w:hAnsi="Arial" w:cs="Arial"/>
-        </w:rPr>
-        <w:t>One-Class</w:t>
-      </w:r>
-      <w:proofErr w:type="spellEnd"/>
-      <w:r>
-        <w:rPr>
-          <w:rFonts w:ascii="Arial" w:hAnsi="Arial" w:cs="Arial"/>
-        </w:rPr>
-        <w:t xml:space="preserve"> </w:t>
-      </w:r>
-      <w:proofErr w:type="spellStart"/>
-      <w:r>
-        <w:rPr>
-          <w:rFonts w:ascii="Arial" w:hAnsi="Arial" w:cs="Arial"/>
-        </w:rPr>
-        <w:t>Classification</w:t>
-      </w:r>
-      <w:proofErr w:type="spellEnd"/>
-      <w:r>
-        <w:rPr>
-          <w:rFonts w:ascii="Arial" w:hAnsi="Arial" w:cs="Arial"/>
-        </w:rPr>
-        <w:t xml:space="preserve">), como </w:t>
-      </w:r>
-      <w:proofErr w:type="spellStart"/>
-      <w:r>
-        <w:rPr>
-          <w:rFonts w:ascii="Arial" w:hAnsi="Arial" w:cs="Arial"/>
-        </w:rPr>
-        <w:t>One-Class</w:t>
-      </w:r>
-      <w:proofErr w:type="spellEnd"/>
-      <w:r>
-        <w:rPr>
-          <w:rFonts w:ascii="Arial" w:hAnsi="Arial" w:cs="Arial"/>
-        </w:rPr>
-        <w:t xml:space="preserve"> SVM, son atractivos para escenarios con escasez de muestras rotuladas de ataques o con alta variabilidad de tráfico normal [KM09, PA15].</w:t>
+        <w:t>En este contexto, los sistemas de detección y prevención de intrusiones (IDS – Intrusion Detection System, IPS – Intrusion Prevention System) y, particularmente, los cortafuegos para aplicaciones web (WAF – Web Application Firewall), juegan un rol fundamental para identificar y mitigar ataques en tiempo real. El uso de técnicas de aprendizaje de máquinas (ML – Machine Learning) permite mejorar la detección de comportamientos anómalos y descubrir patrones emergentes que no están cubiertos por reglas estáticas [2], [3], [4]. En particular, los enfoques de clasificación de una sola clase (OCC – One-Class Classification), como One-Class SVM, son atractivos para escenarios con escasez de muestras rotuladas de ataques o con alta variabilidad de tráfico normal [5], [6].</w:t>
       </w:r>
     </w:p>
     <w:p>
@@ -570,21 +460,7 @@
         <w:rPr>
           <w:rFonts w:ascii="Arial" w:hAnsi="Arial" w:cs="Arial"/>
         </w:rPr>
-        <w:t xml:space="preserve">Este trabajo toma como punto de partida el proyecto base de Nico Ralf [GP5], retomando la idea de incorporar detección de anomalías en un WAF y extendiéndola con nuevas fuentes de datos y características (features) centradas en HTTP. La ampliación propone integrar un </w:t>
-      </w:r>
-      <w:proofErr w:type="spellStart"/>
-      <w:r>
-        <w:rPr>
-          <w:rFonts w:ascii="Arial" w:hAnsi="Arial" w:cs="Arial"/>
-        </w:rPr>
-        <w:t>dataset</w:t>
-      </w:r>
-      <w:proofErr w:type="spellEnd"/>
-      <w:r>
-        <w:rPr>
-          <w:rFonts w:ascii="Arial" w:hAnsi="Arial" w:cs="Arial"/>
-        </w:rPr>
-        <w:t xml:space="preserve"> de tráfico real etiquetado a nivel de patrones de ataque, lo cual permite evaluar no solo la detección binaria (normal/anómalo), sino también la clasificación por tipo de ataque, aumentando la utilidad operativa de los resultados.</w:t>
+        <w:t>Este trabajo toma como punto de partida el proyecto base de Nico Ralf [1], retomando la idea de incorporar detección de anomalías en un WAF y extendiéndola con nuevas fuentes de datos y características (features) centradas en HTTP. La ampliación propone integrar un dataset de tráfico real etiquetado a nivel de patrones de ataque, lo cual permite evaluar no solo la detección binaria (normal/anómalo), sino también la clasificación por tipo de ataque, aumentando la utilidad operativa de los resultados.</w:t>
       </w:r>
     </w:p>
     <w:p>
@@ -758,144 +634,9 @@
       </w:pPr>
       <w:r>
         <w:rPr>
-          <w:rFonts w:ascii="Arial" w:eastAsia="Times New Roman" w:hAnsi="Arial" w:cs="Arial"/>
-          <w:sz w:val="24"/>
-          <w:szCs w:val="24"/>
-          <w:lang w:eastAsia="es-PY"/>
-        </w:rPr>
-        <w:t xml:space="preserve">Diseñar y extraer nuevas </w:t>
-      </w:r>
-      <w:r>
-        <w:rPr>
-          <w:rFonts w:ascii="Arial" w:eastAsia="Times New Roman" w:hAnsi="Arial" w:cs="Arial"/>
-          <w:i/>
-          <w:iCs/>
-          <w:sz w:val="24"/>
-          <w:szCs w:val="24"/>
-          <w:lang w:eastAsia="es-PY"/>
-        </w:rPr>
-        <w:t>features</w:t>
-      </w:r>
-      <w:r>
-        <w:rPr>
-          <w:rFonts w:ascii="Arial" w:eastAsia="Times New Roman" w:hAnsi="Arial" w:cs="Arial"/>
-          <w:sz w:val="24"/>
-          <w:szCs w:val="24"/>
-          <w:lang w:eastAsia="es-PY"/>
-        </w:rPr>
-        <w:t xml:space="preserve"> específicas de HTTP, relacionadas con la estructura de la URI (</w:t>
-      </w:r>
-      <w:proofErr w:type="spellStart"/>
-      <w:r>
-        <w:rPr>
-          <w:rFonts w:ascii="Arial" w:eastAsia="Times New Roman" w:hAnsi="Arial" w:cs="Arial"/>
-          <w:sz w:val="24"/>
-          <w:szCs w:val="24"/>
-          <w:lang w:eastAsia="es-PY"/>
-        </w:rPr>
-        <w:t>Uniform</w:t>
-      </w:r>
-      <w:proofErr w:type="spellEnd"/>
-      <w:r>
-        <w:rPr>
-          <w:rFonts w:ascii="Arial" w:eastAsia="Times New Roman" w:hAnsi="Arial" w:cs="Arial"/>
-          <w:sz w:val="24"/>
-          <w:szCs w:val="24"/>
-          <w:lang w:eastAsia="es-PY"/>
-        </w:rPr>
-        <w:t xml:space="preserve"> </w:t>
-      </w:r>
-      <w:proofErr w:type="spellStart"/>
-      <w:r>
-        <w:rPr>
-          <w:rFonts w:ascii="Arial" w:eastAsia="Times New Roman" w:hAnsi="Arial" w:cs="Arial"/>
-          <w:sz w:val="24"/>
-          <w:szCs w:val="24"/>
-          <w:lang w:eastAsia="es-PY"/>
-        </w:rPr>
-        <w:t>Resource</w:t>
-      </w:r>
-      <w:proofErr w:type="spellEnd"/>
-      <w:r>
-        <w:rPr>
-          <w:rFonts w:ascii="Arial" w:eastAsia="Times New Roman" w:hAnsi="Arial" w:cs="Arial"/>
-          <w:sz w:val="24"/>
-          <w:szCs w:val="24"/>
-          <w:lang w:eastAsia="es-PY"/>
-        </w:rPr>
-        <w:t xml:space="preserve"> </w:t>
-      </w:r>
-      <w:proofErr w:type="spellStart"/>
-      <w:r>
-        <w:rPr>
-          <w:rFonts w:ascii="Arial" w:eastAsia="Times New Roman" w:hAnsi="Arial" w:cs="Arial"/>
-          <w:sz w:val="24"/>
-          <w:szCs w:val="24"/>
-          <w:lang w:eastAsia="es-PY"/>
-        </w:rPr>
-        <w:t>Identifier</w:t>
-      </w:r>
-      <w:proofErr w:type="spellEnd"/>
-      <w:r>
-        <w:rPr>
-          <w:rFonts w:ascii="Arial" w:eastAsia="Times New Roman" w:hAnsi="Arial" w:cs="Arial"/>
-          <w:sz w:val="24"/>
-          <w:szCs w:val="24"/>
-          <w:lang w:eastAsia="es-PY"/>
-        </w:rPr>
-        <w:t xml:space="preserve">), el método de la solicitud, los parámetros de </w:t>
-      </w:r>
-      <w:proofErr w:type="spellStart"/>
-      <w:r>
-        <w:rPr>
-          <w:rFonts w:ascii="Arial" w:eastAsia="Times New Roman" w:hAnsi="Arial" w:cs="Arial"/>
-          <w:i/>
-          <w:iCs/>
-          <w:sz w:val="24"/>
-          <w:szCs w:val="24"/>
-          <w:lang w:eastAsia="es-PY"/>
-        </w:rPr>
-        <w:t>query</w:t>
-      </w:r>
-      <w:proofErr w:type="spellEnd"/>
-      <w:r>
-        <w:rPr>
-          <w:rFonts w:ascii="Arial" w:eastAsia="Times New Roman" w:hAnsi="Arial" w:cs="Arial"/>
-          <w:sz w:val="24"/>
-          <w:szCs w:val="24"/>
-          <w:lang w:eastAsia="es-PY"/>
-        </w:rPr>
-        <w:t xml:space="preserve">, la presencia de </w:t>
-      </w:r>
-      <w:r>
-        <w:rPr>
-          <w:rFonts w:ascii="Arial" w:eastAsia="Times New Roman" w:hAnsi="Arial" w:cs="Arial"/>
-          <w:i/>
-          <w:iCs/>
-          <w:sz w:val="24"/>
-          <w:szCs w:val="24"/>
-          <w:lang w:eastAsia="es-PY"/>
-        </w:rPr>
-        <w:t>tokens</w:t>
-      </w:r>
-      <w:r>
-        <w:rPr>
-          <w:rFonts w:ascii="Arial" w:eastAsia="Times New Roman" w:hAnsi="Arial" w:cs="Arial"/>
-          <w:sz w:val="24"/>
-          <w:szCs w:val="24"/>
-          <w:lang w:eastAsia="es-PY"/>
-        </w:rPr>
-        <w:t xml:space="preserve"> sospechosos en el contenido y el uso de métodos poco comunes. La motivación de esta </w:t>
-      </w:r>
-      <w:r>
-        <w:rPr>
-          <w:rFonts w:ascii="Arial" w:eastAsia="Times New Roman" w:hAnsi="Arial" w:cs="Arial"/>
-          <w:sz w:val="24"/>
-          <w:szCs w:val="24"/>
-          <w:lang w:eastAsia="es-PY"/>
-        </w:rPr>
-        <w:lastRenderedPageBreak/>
-        <w:t>selección radica en que tales rasgos han sido vinculados directamente con patrones de explotación típicos en ataques web modernos [N+11].</w:t>
+          <w:rFonts w:ascii="Arial" w:hAnsi="Arial" w:cs="Arial"/>
+        </w:rPr>
+        <w:t>Diseñar y extraer nuevas features específicas de HTTP, relacionadas con la estructura de la URI (Uniform Resource Identifier), el método de la solicitud, los parámetros de query, la presencia de tokens sospechosos en el contenido y el uso de métodos poco comunes. La motivación de esta selección radica en que tales rasgos han sido vinculados directamente con patrones de explotación típicos en ataques web modernos [4].</w:t>
       </w:r>
     </w:p>
     <w:p>
@@ -920,6 +661,7 @@
           <w:szCs w:val="24"/>
           <w:lang w:eastAsia="es-PY"/>
         </w:rPr>
+        <w:lastRenderedPageBreak/>
         <w:t xml:space="preserve">Analizar el impacto de las nuevas </w:t>
       </w:r>
       <w:r>
@@ -1007,264 +749,8 @@
       <w:r>
         <w:rPr>
           <w:rFonts w:ascii="Arial" w:hAnsi="Arial" w:cs="Arial"/>
-          <w:sz w:val="24"/>
-          <w:szCs w:val="24"/>
-        </w:rPr>
-        <w:t xml:space="preserve">Este trabajo amplía y actualiza el proyecto base de Nico Ralf [GP5], integrando un WAF experimental con etiquetado por tipo de ataque y nuevas características de tráfico HTTP. La ampliación se centra en incorporar el </w:t>
-      </w:r>
-      <w:proofErr w:type="spellStart"/>
-      <w:r>
-        <w:rPr>
-          <w:rFonts w:ascii="Arial" w:hAnsi="Arial" w:cs="Arial"/>
-          <w:sz w:val="24"/>
-          <w:szCs w:val="24"/>
-        </w:rPr>
-        <w:t>dataset</w:t>
-      </w:r>
-      <w:proofErr w:type="spellEnd"/>
-      <w:r>
-        <w:rPr>
-          <w:rFonts w:ascii="Arial" w:hAnsi="Arial" w:cs="Arial"/>
-          <w:sz w:val="24"/>
-          <w:szCs w:val="24"/>
-        </w:rPr>
-        <w:t xml:space="preserve"> SR-BH 2020, publicado en Harvard </w:t>
-      </w:r>
-      <w:proofErr w:type="spellStart"/>
-      <w:r>
-        <w:rPr>
-          <w:rFonts w:ascii="Arial" w:hAnsi="Arial" w:cs="Arial"/>
-          <w:sz w:val="24"/>
-          <w:szCs w:val="24"/>
-        </w:rPr>
-        <w:t>Dataverse</w:t>
-      </w:r>
-      <w:proofErr w:type="spellEnd"/>
-      <w:r>
-        <w:rPr>
-          <w:rFonts w:ascii="Arial" w:hAnsi="Arial" w:cs="Arial"/>
-          <w:sz w:val="24"/>
-          <w:szCs w:val="24"/>
-        </w:rPr>
-        <w:t xml:space="preserve"> [Dat20], el cual contiene tráfico web real capturado con </w:t>
-      </w:r>
-      <w:proofErr w:type="spellStart"/>
-      <w:r>
-        <w:rPr>
-          <w:rFonts w:ascii="Arial" w:hAnsi="Arial" w:cs="Arial"/>
-          <w:sz w:val="24"/>
-          <w:szCs w:val="24"/>
-        </w:rPr>
-        <w:t>ModSecurity</w:t>
-      </w:r>
-      <w:proofErr w:type="spellEnd"/>
-      <w:r>
-        <w:rPr>
-          <w:rFonts w:ascii="Arial" w:hAnsi="Arial" w:cs="Arial"/>
-          <w:sz w:val="24"/>
-          <w:szCs w:val="24"/>
-        </w:rPr>
-        <w:t xml:space="preserve"> en un </w:t>
-      </w:r>
-      <w:proofErr w:type="spellStart"/>
-      <w:r>
-        <w:rPr>
-          <w:rFonts w:ascii="Arial" w:hAnsi="Arial" w:cs="Arial"/>
-          <w:i/>
-          <w:iCs/>
-          <w:sz w:val="24"/>
-          <w:szCs w:val="24"/>
-        </w:rPr>
-        <w:t>honeypot</w:t>
-      </w:r>
-      <w:proofErr w:type="spellEnd"/>
-      <w:r>
-        <w:rPr>
-          <w:rFonts w:ascii="Arial" w:hAnsi="Arial" w:cs="Arial"/>
-          <w:sz w:val="24"/>
-          <w:szCs w:val="24"/>
-        </w:rPr>
-        <w:t xml:space="preserve"> y etiquetado manualmente a nivel de patrones </w:t>
-      </w:r>
-      <w:proofErr w:type="spellStart"/>
-      <w:r>
-        <w:rPr>
-          <w:rFonts w:ascii="Arial" w:hAnsi="Arial" w:cs="Arial"/>
-          <w:i/>
-          <w:iCs/>
-          <w:sz w:val="24"/>
-          <w:szCs w:val="24"/>
-        </w:rPr>
-        <w:t>Common</w:t>
-      </w:r>
-      <w:proofErr w:type="spellEnd"/>
-      <w:r>
-        <w:rPr>
-          <w:rFonts w:ascii="Arial" w:hAnsi="Arial" w:cs="Arial"/>
-          <w:i/>
-          <w:iCs/>
-          <w:sz w:val="24"/>
-          <w:szCs w:val="24"/>
-        </w:rPr>
-        <w:t xml:space="preserve"> </w:t>
-      </w:r>
-      <w:proofErr w:type="spellStart"/>
-      <w:r>
-        <w:rPr>
-          <w:rFonts w:ascii="Arial" w:hAnsi="Arial" w:cs="Arial"/>
-          <w:i/>
-          <w:iCs/>
-          <w:sz w:val="24"/>
-          <w:szCs w:val="24"/>
-        </w:rPr>
-        <w:t>Attack</w:t>
-      </w:r>
-      <w:proofErr w:type="spellEnd"/>
-      <w:r>
-        <w:rPr>
-          <w:rFonts w:ascii="Arial" w:hAnsi="Arial" w:cs="Arial"/>
-          <w:i/>
-          <w:iCs/>
-          <w:sz w:val="24"/>
-          <w:szCs w:val="24"/>
-        </w:rPr>
-        <w:t xml:space="preserve"> </w:t>
-      </w:r>
-      <w:proofErr w:type="spellStart"/>
-      <w:r>
-        <w:rPr>
-          <w:rFonts w:ascii="Arial" w:hAnsi="Arial" w:cs="Arial"/>
-          <w:i/>
-          <w:iCs/>
-          <w:sz w:val="24"/>
-          <w:szCs w:val="24"/>
-        </w:rPr>
-        <w:t>Pattern</w:t>
-      </w:r>
-      <w:proofErr w:type="spellEnd"/>
-      <w:r>
-        <w:rPr>
-          <w:rFonts w:ascii="Arial" w:hAnsi="Arial" w:cs="Arial"/>
-          <w:i/>
-          <w:iCs/>
-          <w:sz w:val="24"/>
-          <w:szCs w:val="24"/>
-        </w:rPr>
-        <w:t xml:space="preserve"> </w:t>
-      </w:r>
-      <w:proofErr w:type="spellStart"/>
-      <w:r>
-        <w:rPr>
-          <w:rFonts w:ascii="Arial" w:hAnsi="Arial" w:cs="Arial"/>
-          <w:i/>
-          <w:iCs/>
-          <w:sz w:val="24"/>
-          <w:szCs w:val="24"/>
-        </w:rPr>
-        <w:t>Enumeration</w:t>
-      </w:r>
-      <w:proofErr w:type="spellEnd"/>
-      <w:r>
-        <w:rPr>
-          <w:rFonts w:ascii="Arial" w:hAnsi="Arial" w:cs="Arial"/>
-          <w:i/>
-          <w:iCs/>
-          <w:sz w:val="24"/>
-          <w:szCs w:val="24"/>
-        </w:rPr>
-        <w:t xml:space="preserve"> and </w:t>
-      </w:r>
-      <w:proofErr w:type="spellStart"/>
-      <w:r>
-        <w:rPr>
-          <w:rFonts w:ascii="Arial" w:hAnsi="Arial" w:cs="Arial"/>
-          <w:i/>
-          <w:iCs/>
-          <w:sz w:val="24"/>
-          <w:szCs w:val="24"/>
-        </w:rPr>
-        <w:t>Classification</w:t>
-      </w:r>
-      <w:proofErr w:type="spellEnd"/>
-      <w:r>
-        <w:rPr>
-          <w:rFonts w:ascii="Arial" w:hAnsi="Arial" w:cs="Arial"/>
-          <w:sz w:val="24"/>
-          <w:szCs w:val="24"/>
-        </w:rPr>
-        <w:t xml:space="preserve"> (CAPEC). Esta fuente de datos introduce mayor realismo (volumen y diversidad), permitiendo la comparación con los escenarios anteriores basados en CSIC/</w:t>
-      </w:r>
-      <w:proofErr w:type="spellStart"/>
-      <w:r>
-        <w:rPr>
-          <w:rFonts w:ascii="Arial" w:hAnsi="Arial" w:cs="Arial"/>
-          <w:sz w:val="24"/>
-          <w:szCs w:val="24"/>
-        </w:rPr>
-        <w:t>TorpEda</w:t>
-      </w:r>
-      <w:proofErr w:type="spellEnd"/>
-      <w:r>
-        <w:rPr>
-          <w:rFonts w:ascii="Arial" w:hAnsi="Arial" w:cs="Arial"/>
-          <w:sz w:val="24"/>
-          <w:szCs w:val="24"/>
-        </w:rPr>
-        <w:t xml:space="preserve"> y, además, habilitando la evaluación multiclase y, cuando aplique, </w:t>
-      </w:r>
-      <w:proofErr w:type="spellStart"/>
-      <w:r>
-        <w:rPr>
-          <w:rFonts w:ascii="Arial" w:hAnsi="Arial" w:cs="Arial"/>
-          <w:sz w:val="24"/>
-          <w:szCs w:val="24"/>
-        </w:rPr>
-        <w:t>multietiqueta</w:t>
-      </w:r>
-      <w:proofErr w:type="spellEnd"/>
-      <w:r>
-        <w:rPr>
-          <w:rFonts w:ascii="Arial" w:hAnsi="Arial" w:cs="Arial"/>
-          <w:sz w:val="24"/>
-          <w:szCs w:val="24"/>
-        </w:rPr>
-        <w:t xml:space="preserve">. En la literatura reciente (2024–2025), el </w:t>
-      </w:r>
-      <w:proofErr w:type="spellStart"/>
-      <w:r>
-        <w:rPr>
-          <w:rFonts w:ascii="Arial" w:hAnsi="Arial" w:cs="Arial"/>
-          <w:sz w:val="24"/>
-          <w:szCs w:val="24"/>
-        </w:rPr>
-        <w:t>dataset</w:t>
-      </w:r>
-      <w:proofErr w:type="spellEnd"/>
-      <w:r>
-        <w:rPr>
-          <w:rFonts w:ascii="Arial" w:hAnsi="Arial" w:cs="Arial"/>
-          <w:sz w:val="24"/>
-          <w:szCs w:val="24"/>
-        </w:rPr>
-        <w:t xml:space="preserve"> se utiliza como referente para evaluación </w:t>
-      </w:r>
-      <w:proofErr w:type="spellStart"/>
-      <w:r>
-        <w:rPr>
-          <w:rFonts w:ascii="Arial" w:hAnsi="Arial" w:cs="Arial"/>
-          <w:sz w:val="24"/>
-          <w:szCs w:val="24"/>
-        </w:rPr>
-        <w:t>multietiqueta</w:t>
-      </w:r>
-      <w:proofErr w:type="spellEnd"/>
-      <w:r>
-        <w:rPr>
-          <w:rFonts w:ascii="Arial" w:hAnsi="Arial" w:cs="Arial"/>
-          <w:sz w:val="24"/>
-          <w:szCs w:val="24"/>
-        </w:rPr>
-        <w:t xml:space="preserve"> y reportes por clase CAPEC, facilitando la comparabilidad de resultados y su validez externa.</w:t>
+        </w:rPr>
+        <w:t>Este trabajo amplía y actualiza el proyecto base de Nico Ralf [1], integrando un WAF experimental con etiquetado por tipo de ataque y nuevas características de tráfico HTTP. La ampliación se centra en incorporar el dataset SR-BH 2020, publicado en Harvard Dataverse [7], el cual contiene tráfico web real capturado con ModSecurity en un honeypot y etiquetado manualmente a nivel de patrones Common Attack Pattern Enumeration and Classification (CAPEC). Esta fuente de datos introduce mayor realismo (volumen y diversidad), permitiendo la comparación con los escenarios anteriores basados en CSIC/TorpEda y, además, habilitando la evaluación multiclase y, cuando aplique, multietiqueta. En la literatura reciente (2024–2025), el dataset se utiliza como referente para evaluación multietiqueta y reportes por clase CAPEC, facilitando la comparabilidad de resultados y su validez externa.</w:t>
       </w:r>
     </w:p>
     <w:p>
@@ -1301,72 +787,26 @@
       <w:r>
         <w:rPr>
           <w:rFonts w:ascii="Arial" w:hAnsi="Arial" w:cs="Arial"/>
-          <w:sz w:val="24"/>
-          <w:szCs w:val="24"/>
-        </w:rPr>
-        <w:t>1-</w:t>
-      </w:r>
-      <w:r>
-        <w:rPr>
-          <w:rFonts w:ascii="Arial" w:hAnsi="Arial" w:cs="Arial"/>
-          <w:sz w:val="24"/>
-          <w:szCs w:val="24"/>
-        </w:rPr>
-        <w:t xml:space="preserve"> </w:t>
-      </w:r>
-      <w:r>
-        <w:rPr>
-          <w:rFonts w:ascii="Arial" w:hAnsi="Arial" w:cs="Arial"/>
-          <w:sz w:val="24"/>
-          <w:szCs w:val="24"/>
-        </w:rPr>
-        <w:t xml:space="preserve">Integración de un nuevo </w:t>
-      </w:r>
-      <w:proofErr w:type="spellStart"/>
-      <w:r>
-        <w:rPr>
-          <w:rFonts w:ascii="Arial" w:hAnsi="Arial" w:cs="Arial"/>
-          <w:i/>
-          <w:iCs/>
-          <w:sz w:val="24"/>
-          <w:szCs w:val="24"/>
-        </w:rPr>
-        <w:t>dataset</w:t>
-      </w:r>
-      <w:proofErr w:type="spellEnd"/>
-      <w:r>
-        <w:rPr>
-          <w:rFonts w:ascii="Arial" w:hAnsi="Arial" w:cs="Arial"/>
-          <w:sz w:val="24"/>
-          <w:szCs w:val="24"/>
-        </w:rPr>
-        <w:t xml:space="preserve"> realista: incorporar SR-BH 2020 [Dat20] y compararlo con escenarios heredados (CSIC-2010/TorpEda-2012), elevando el realismo y la diversidad (más de 900k solicitudes, 24 características y 13 etiquetas a nivel CAPEC).</w:t>
-      </w:r>
-    </w:p>
-    <w:p>
-      <w:pPr>
-        <w:jc w:val="both"/>
-        <w:rPr>
-          <w:rFonts w:ascii="Arial" w:hAnsi="Arial" w:cs="Arial"/>
-          <w:sz w:val="24"/>
-          <w:szCs w:val="24"/>
-        </w:rPr>
-      </w:pPr>
-      <w:r>
-        <w:rPr>
-          <w:rFonts w:ascii="Arial" w:hAnsi="Arial" w:cs="Arial"/>
-          <w:sz w:val="24"/>
-          <w:szCs w:val="24"/>
-        </w:rPr>
-        <w:t xml:space="preserve">2- </w:t>
-      </w:r>
-      <w:r>
-        <w:rPr>
-          <w:rFonts w:ascii="Arial" w:hAnsi="Arial" w:cs="Arial"/>
-          <w:sz w:val="24"/>
-          <w:szCs w:val="24"/>
-        </w:rPr>
-        <w:t>Etiquetado por tipo de ataque: pasar de un esquema binario (normal/anómalo) a clasificación por clase de ataque (</w:t>
+        </w:rPr>
+        <w:t>1- Integración de un nuevo dataset realista: incorporar SR-BH 2020 [7] y compararlo con escenarios heredados (CSIC-2010/TorpEda-2012), elevando el realismo y la diversidad (más de 900k solicitudes, 24 características y 13 etiquetas a nivel CAPEC).</w:t>
+      </w:r>
+    </w:p>
+    <w:p>
+      <w:pPr>
+        <w:jc w:val="both"/>
+        <w:rPr>
+          <w:rFonts w:ascii="Arial" w:hAnsi="Arial" w:cs="Arial"/>
+          <w:sz w:val="24"/>
+          <w:szCs w:val="24"/>
+        </w:rPr>
+      </w:pPr>
+      <w:r>
+        <w:rPr>
+          <w:rFonts w:ascii="Arial" w:hAnsi="Arial" w:cs="Arial"/>
+          <w:sz w:val="24"/>
+          <w:szCs w:val="24"/>
+        </w:rPr>
+        <w:t>2- Etiquetado por tipo de ataque: pasar de un esquema binario (normal/anómalo) a clasificación por clase de ataque (</w:t>
       </w:r>
       <w:r>
         <w:rPr>
@@ -1825,7 +1265,6 @@
           <w:sz w:val="24"/>
           <w:szCs w:val="24"/>
         </w:rPr>
-        <w:lastRenderedPageBreak/>
         <w:t>encoded</w:t>
       </w:r>
       <w:proofErr w:type="spellEnd"/>
@@ -2116,6 +1555,7 @@
           <w:sz w:val="24"/>
           <w:szCs w:val="24"/>
         </w:rPr>
+        <w:lastRenderedPageBreak/>
         <w:t>req_content_length</w:t>
       </w:r>
       <w:proofErr w:type="spellEnd"/>
@@ -2170,10 +1610,8 @@
       <w:r>
         <w:rPr>
           <w:rFonts w:ascii="Arial" w:hAnsi="Arial" w:cs="Arial"/>
-          <w:sz w:val="24"/>
-          <w:szCs w:val="24"/>
-        </w:rPr>
-        <w:t>Véanse, por ejemplo, [SRBHBH+22, RBMP24, FWY+24, ZZC+24].</w:t>
+        </w:rPr>
+        <w:t>Véanse, por ejemplo, [8], [9], [10], [11].</w:t>
       </w:r>
     </w:p>
     <w:p>
@@ -2354,17 +1792,7 @@
           <w:sz w:val="28"/>
           <w:szCs w:val="28"/>
         </w:rPr>
-        <w:t xml:space="preserve">Metodología y </w:t>
-      </w:r>
-      <w:r>
-        <w:rPr>
-          <w:rFonts w:ascii="Arial" w:hAnsi="Arial" w:cs="Arial"/>
-          <w:b/>
-          <w:bCs/>
-          <w:sz w:val="28"/>
-          <w:szCs w:val="28"/>
-        </w:rPr>
-        <w:t>diseño</w:t>
+        <w:t>Metodología y diseño</w:t>
       </w:r>
       <w:r>
         <w:rPr>
@@ -2395,17 +1823,7 @@
           <w:sz w:val="24"/>
           <w:szCs w:val="24"/>
         </w:rPr>
-        <w:t xml:space="preserve">1- </w:t>
-      </w:r>
-      <w:r>
-        <w:rPr>
-          <w:rFonts w:ascii="Arial" w:hAnsi="Arial" w:cs="Arial"/>
-          <w:b/>
-          <w:bCs/>
-          <w:sz w:val="24"/>
-          <w:szCs w:val="24"/>
-        </w:rPr>
-        <w:t xml:space="preserve">Preprocesamiento y </w:t>
+        <w:t xml:space="preserve">1- Preprocesamiento y </w:t>
       </w:r>
       <w:proofErr w:type="spellStart"/>
       <w:r>
@@ -2555,8 +1973,166 @@
           <w:sz w:val="24"/>
           <w:szCs w:val="24"/>
         </w:rPr>
-        <w:t xml:space="preserve">3- </w:t>
-      </w:r>
+        <w:t>3- Entrenamiento y selección</w:t>
+      </w:r>
+      <w:r>
+        <w:rPr>
+          <w:rFonts w:ascii="Arial" w:hAnsi="Arial" w:cs="Arial"/>
+          <w:sz w:val="24"/>
+          <w:szCs w:val="24"/>
+        </w:rPr>
+        <w:t xml:space="preserve">: comparación de </w:t>
+      </w:r>
+      <w:proofErr w:type="spellStart"/>
+      <w:r>
+        <w:rPr>
+          <w:rFonts w:ascii="Arial" w:hAnsi="Arial" w:cs="Arial"/>
+          <w:sz w:val="24"/>
+          <w:szCs w:val="24"/>
+        </w:rPr>
+        <w:t>One-Class</w:t>
+      </w:r>
+      <w:proofErr w:type="spellEnd"/>
+      <w:r>
+        <w:rPr>
+          <w:rFonts w:ascii="Arial" w:hAnsi="Arial" w:cs="Arial"/>
+          <w:sz w:val="24"/>
+          <w:szCs w:val="24"/>
+        </w:rPr>
+        <w:t xml:space="preserve"> SVM frente a </w:t>
+      </w:r>
+      <w:proofErr w:type="spellStart"/>
+      <w:r>
+        <w:rPr>
+          <w:rFonts w:ascii="Arial" w:hAnsi="Arial" w:cs="Arial"/>
+          <w:i/>
+          <w:iCs/>
+          <w:sz w:val="24"/>
+          <w:szCs w:val="24"/>
+        </w:rPr>
+        <w:t>baselines</w:t>
+      </w:r>
+      <w:proofErr w:type="spellEnd"/>
+      <w:r>
+        <w:rPr>
+          <w:rFonts w:ascii="Arial" w:hAnsi="Arial" w:cs="Arial"/>
+          <w:sz w:val="24"/>
+          <w:szCs w:val="24"/>
+        </w:rPr>
+        <w:t xml:space="preserve"> supervisados; búsqueda de </w:t>
+      </w:r>
+      <w:proofErr w:type="spellStart"/>
+      <w:r>
+        <w:rPr>
+          <w:rFonts w:ascii="Arial" w:hAnsi="Arial" w:cs="Arial"/>
+          <w:sz w:val="24"/>
+          <w:szCs w:val="24"/>
+        </w:rPr>
+        <w:t>hiperparámetros</w:t>
+      </w:r>
+      <w:proofErr w:type="spellEnd"/>
+      <w:r>
+        <w:rPr>
+          <w:rFonts w:ascii="Arial" w:hAnsi="Arial" w:cs="Arial"/>
+          <w:sz w:val="24"/>
+          <w:szCs w:val="24"/>
+        </w:rPr>
+        <w:t xml:space="preserve"> mediante </w:t>
+      </w:r>
+      <w:proofErr w:type="spellStart"/>
+      <w:r>
+        <w:rPr>
+          <w:rFonts w:ascii="Arial" w:hAnsi="Arial" w:cs="Arial"/>
+          <w:i/>
+          <w:iCs/>
+          <w:sz w:val="24"/>
+          <w:szCs w:val="24"/>
+        </w:rPr>
+        <w:t>grid</w:t>
+      </w:r>
+      <w:proofErr w:type="spellEnd"/>
+      <w:r>
+        <w:rPr>
+          <w:rFonts w:ascii="Arial" w:hAnsi="Arial" w:cs="Arial"/>
+          <w:i/>
+          <w:iCs/>
+          <w:sz w:val="24"/>
+          <w:szCs w:val="24"/>
+        </w:rPr>
+        <w:t xml:space="preserve"> </w:t>
+      </w:r>
+      <w:proofErr w:type="spellStart"/>
+      <w:r>
+        <w:rPr>
+          <w:rFonts w:ascii="Arial" w:hAnsi="Arial" w:cs="Arial"/>
+          <w:i/>
+          <w:iCs/>
+          <w:sz w:val="24"/>
+          <w:szCs w:val="24"/>
+        </w:rPr>
+        <w:t>search</w:t>
+      </w:r>
+      <w:proofErr w:type="spellEnd"/>
+      <w:r>
+        <w:rPr>
+          <w:rFonts w:ascii="Arial" w:hAnsi="Arial" w:cs="Arial"/>
+          <w:sz w:val="24"/>
+          <w:szCs w:val="24"/>
+        </w:rPr>
+        <w:t>/</w:t>
+      </w:r>
+      <w:proofErr w:type="spellStart"/>
+      <w:r>
+        <w:rPr>
+          <w:rFonts w:ascii="Arial" w:hAnsi="Arial" w:cs="Arial"/>
+          <w:i/>
+          <w:iCs/>
+          <w:sz w:val="24"/>
+          <w:szCs w:val="24"/>
+        </w:rPr>
+        <w:t>random</w:t>
+      </w:r>
+      <w:proofErr w:type="spellEnd"/>
+      <w:r>
+        <w:rPr>
+          <w:rFonts w:ascii="Arial" w:hAnsi="Arial" w:cs="Arial"/>
+          <w:i/>
+          <w:iCs/>
+          <w:sz w:val="24"/>
+          <w:szCs w:val="24"/>
+        </w:rPr>
+        <w:t xml:space="preserve"> </w:t>
+      </w:r>
+      <w:proofErr w:type="spellStart"/>
+      <w:r>
+        <w:rPr>
+          <w:rFonts w:ascii="Arial" w:hAnsi="Arial" w:cs="Arial"/>
+          <w:i/>
+          <w:iCs/>
+          <w:sz w:val="24"/>
+          <w:szCs w:val="24"/>
+        </w:rPr>
+        <w:t>search</w:t>
+      </w:r>
+      <w:proofErr w:type="spellEnd"/>
+      <w:r>
+        <w:rPr>
+          <w:rFonts w:ascii="Arial" w:hAnsi="Arial" w:cs="Arial"/>
+          <w:sz w:val="24"/>
+          <w:szCs w:val="24"/>
+        </w:rPr>
+        <w:t xml:space="preserve"> con validación cruzada.</w:t>
+      </w:r>
+    </w:p>
+    <w:p>
+      <w:pPr>
+        <w:jc w:val="both"/>
+        <w:rPr>
+          <w:rFonts w:ascii="Arial" w:hAnsi="Arial" w:cs="Arial"/>
+          <w:sz w:val="24"/>
+          <w:szCs w:val="24"/>
+        </w:rPr>
+      </w:pPr>
       <w:r>
         <w:rPr>
           <w:rFonts w:ascii="Arial" w:hAnsi="Arial" w:cs="Arial"/>
@@ -2565,33 +2141,15 @@
           <w:sz w:val="24"/>
           <w:szCs w:val="24"/>
         </w:rPr>
-        <w:t>Entrenamiento y selección</w:t>
-      </w:r>
-      <w:r>
-        <w:rPr>
-          <w:rFonts w:ascii="Arial" w:hAnsi="Arial" w:cs="Arial"/>
-          <w:sz w:val="24"/>
-          <w:szCs w:val="24"/>
-        </w:rPr>
-        <w:t xml:space="preserve">: comparación de </w:t>
-      </w:r>
-      <w:proofErr w:type="spellStart"/>
-      <w:r>
-        <w:rPr>
-          <w:rFonts w:ascii="Arial" w:hAnsi="Arial" w:cs="Arial"/>
-          <w:sz w:val="24"/>
-          <w:szCs w:val="24"/>
-        </w:rPr>
-        <w:t>One-Class</w:t>
-      </w:r>
-      <w:proofErr w:type="spellEnd"/>
-      <w:r>
-        <w:rPr>
-          <w:rFonts w:ascii="Arial" w:hAnsi="Arial" w:cs="Arial"/>
-          <w:sz w:val="24"/>
-          <w:szCs w:val="24"/>
-        </w:rPr>
-        <w:t xml:space="preserve"> SVM frente a </w:t>
+        <w:t>4- Métricas</w:t>
+      </w:r>
+      <w:r>
+        <w:rPr>
+          <w:rFonts w:ascii="Arial" w:hAnsi="Arial" w:cs="Arial"/>
+          <w:sz w:val="24"/>
+          <w:szCs w:val="24"/>
+        </w:rPr>
+        <w:t xml:space="preserve">: precisión, </w:t>
       </w:r>
       <w:proofErr w:type="spellStart"/>
       <w:r>
@@ -2602,7 +2160,7 @@
           <w:sz w:val="24"/>
           <w:szCs w:val="24"/>
         </w:rPr>
-        <w:t>baselines</w:t>
+        <w:t>recall</w:t>
       </w:r>
       <w:proofErr w:type="spellEnd"/>
       <w:r>
@@ -2611,27 +2169,8 @@
           <w:sz w:val="24"/>
           <w:szCs w:val="24"/>
         </w:rPr>
-        <w:t xml:space="preserve"> supervisados; búsqueda de </w:t>
-      </w:r>
-      <w:proofErr w:type="spellStart"/>
-      <w:r>
-        <w:rPr>
-          <w:rFonts w:ascii="Arial" w:hAnsi="Arial" w:cs="Arial"/>
-          <w:sz w:val="24"/>
-          <w:szCs w:val="24"/>
-        </w:rPr>
-        <w:t>hiperparámetros</w:t>
-      </w:r>
-      <w:proofErr w:type="spellEnd"/>
-      <w:r>
-        <w:rPr>
-          <w:rFonts w:ascii="Arial" w:hAnsi="Arial" w:cs="Arial"/>
-          <w:sz w:val="24"/>
-          <w:szCs w:val="24"/>
-        </w:rPr>
-        <w:t xml:space="preserve"> mediante </w:t>
-      </w:r>
-      <w:proofErr w:type="spellStart"/>
+        <w:t>, F1-score (macro/micro), curvas ROC (</w:t>
+      </w:r>
       <w:r>
         <w:rPr>
           <w:rFonts w:ascii="Arial" w:hAnsi="Arial" w:cs="Arial"/>
@@ -2640,9 +2179,9 @@
           <w:sz w:val="24"/>
           <w:szCs w:val="24"/>
         </w:rPr>
-        <w:t>grid</w:t>
-      </w:r>
-      <w:proofErr w:type="spellEnd"/>
+        <w:t xml:space="preserve">Receiver </w:t>
+      </w:r>
+      <w:proofErr w:type="spellStart"/>
       <w:r>
         <w:rPr>
           <w:rFonts w:ascii="Arial" w:hAnsi="Arial" w:cs="Arial"/>
@@ -2651,9 +2190,9 @@
           <w:sz w:val="24"/>
           <w:szCs w:val="24"/>
         </w:rPr>
-        <w:t xml:space="preserve"> </w:t>
-      </w:r>
-      <w:proofErr w:type="spellStart"/>
+        <w:t>Operating</w:t>
+      </w:r>
+      <w:proofErr w:type="spellEnd"/>
       <w:r>
         <w:rPr>
           <w:rFonts w:ascii="Arial" w:hAnsi="Arial" w:cs="Arial"/>
@@ -2662,16 +2201,7 @@
           <w:sz w:val="24"/>
           <w:szCs w:val="24"/>
         </w:rPr>
-        <w:t>search</w:t>
-      </w:r>
-      <w:proofErr w:type="spellEnd"/>
-      <w:r>
-        <w:rPr>
-          <w:rFonts w:ascii="Arial" w:hAnsi="Arial" w:cs="Arial"/>
-          <w:sz w:val="24"/>
-          <w:szCs w:val="24"/>
-        </w:rPr>
-        <w:t>/</w:t>
+        <w:t xml:space="preserve"> </w:t>
       </w:r>
       <w:proofErr w:type="spellStart"/>
       <w:r>
@@ -2682,9 +2212,18 @@
           <w:sz w:val="24"/>
           <w:szCs w:val="24"/>
         </w:rPr>
-        <w:t>random</w:t>
+        <w:t>Characteristic</w:t>
       </w:r>
       <w:proofErr w:type="spellEnd"/>
+      <w:r>
+        <w:rPr>
+          <w:rFonts w:ascii="Arial" w:hAnsi="Arial" w:cs="Arial"/>
+          <w:sz w:val="24"/>
+          <w:szCs w:val="24"/>
+        </w:rPr>
+        <w:t xml:space="preserve">) y AUC (cuando corresponda); </w:t>
+      </w:r>
+      <w:proofErr w:type="spellStart"/>
       <w:r>
         <w:rPr>
           <w:rFonts w:ascii="Arial" w:hAnsi="Arial" w:cs="Arial"/>
@@ -2693,9 +2232,9 @@
           <w:sz w:val="24"/>
           <w:szCs w:val="24"/>
         </w:rPr>
-        <w:t xml:space="preserve"> </w:t>
-      </w:r>
-      <w:proofErr w:type="spellStart"/>
+        <w:t>Hamming</w:t>
+      </w:r>
+      <w:proofErr w:type="spellEnd"/>
       <w:r>
         <w:rPr>
           <w:rFonts w:ascii="Arial" w:hAnsi="Arial" w:cs="Arial"/>
@@ -2704,7 +2243,18 @@
           <w:sz w:val="24"/>
           <w:szCs w:val="24"/>
         </w:rPr>
-        <w:t>search</w:t>
+        <w:t xml:space="preserve"> </w:t>
+      </w:r>
+      <w:proofErr w:type="spellStart"/>
+      <w:r>
+        <w:rPr>
+          <w:rFonts w:ascii="Arial" w:hAnsi="Arial" w:cs="Arial"/>
+          <w:i/>
+          <w:iCs/>
+          <w:sz w:val="24"/>
+          <w:szCs w:val="24"/>
+        </w:rPr>
+        <w:t>Loss</w:t>
       </w:r>
       <w:proofErr w:type="spellEnd"/>
       <w:r>
@@ -2713,7 +2263,25 @@
           <w:sz w:val="24"/>
           <w:szCs w:val="24"/>
         </w:rPr>
-        <w:t xml:space="preserve"> con validación cruzada.</w:t>
+        <w:t xml:space="preserve"> para experimentos </w:t>
+      </w:r>
+      <w:proofErr w:type="spellStart"/>
+      <w:r>
+        <w:rPr>
+          <w:rFonts w:ascii="Arial" w:hAnsi="Arial" w:cs="Arial"/>
+          <w:sz w:val="24"/>
+          <w:szCs w:val="24"/>
+        </w:rPr>
+        <w:t>multietiqueta</w:t>
+      </w:r>
+      <w:proofErr w:type="spellEnd"/>
+      <w:r>
+        <w:rPr>
+          <w:rFonts w:ascii="Arial" w:hAnsi="Arial" w:cs="Arial"/>
+          <w:sz w:val="24"/>
+          <w:szCs w:val="24"/>
+        </w:rPr>
+        <w:t>.</w:t>
       </w:r>
     </w:p>
     <w:p>
@@ -2733,187 +2301,7 @@
           <w:sz w:val="24"/>
           <w:szCs w:val="24"/>
         </w:rPr>
-        <w:t xml:space="preserve">4- </w:t>
-      </w:r>
-      <w:r>
-        <w:rPr>
-          <w:rFonts w:ascii="Arial" w:hAnsi="Arial" w:cs="Arial"/>
-          <w:b/>
-          <w:bCs/>
-          <w:sz w:val="24"/>
-          <w:szCs w:val="24"/>
-        </w:rPr>
-        <w:t>Métricas</w:t>
-      </w:r>
-      <w:r>
-        <w:rPr>
-          <w:rFonts w:ascii="Arial" w:hAnsi="Arial" w:cs="Arial"/>
-          <w:sz w:val="24"/>
-          <w:szCs w:val="24"/>
-        </w:rPr>
-        <w:t xml:space="preserve">: precisión, </w:t>
-      </w:r>
-      <w:proofErr w:type="spellStart"/>
-      <w:r>
-        <w:rPr>
-          <w:rFonts w:ascii="Arial" w:hAnsi="Arial" w:cs="Arial"/>
-          <w:i/>
-          <w:iCs/>
-          <w:sz w:val="24"/>
-          <w:szCs w:val="24"/>
-        </w:rPr>
-        <w:t>recall</w:t>
-      </w:r>
-      <w:proofErr w:type="spellEnd"/>
-      <w:r>
-        <w:rPr>
-          <w:rFonts w:ascii="Arial" w:hAnsi="Arial" w:cs="Arial"/>
-          <w:sz w:val="24"/>
-          <w:szCs w:val="24"/>
-        </w:rPr>
-        <w:t>, F1-score (macro/micro), curvas ROC (</w:t>
-      </w:r>
-      <w:r>
-        <w:rPr>
-          <w:rFonts w:ascii="Arial" w:hAnsi="Arial" w:cs="Arial"/>
-          <w:i/>
-          <w:iCs/>
-          <w:sz w:val="24"/>
-          <w:szCs w:val="24"/>
-        </w:rPr>
-        <w:t xml:space="preserve">Receiver </w:t>
-      </w:r>
-      <w:proofErr w:type="spellStart"/>
-      <w:r>
-        <w:rPr>
-          <w:rFonts w:ascii="Arial" w:hAnsi="Arial" w:cs="Arial"/>
-          <w:i/>
-          <w:iCs/>
-          <w:sz w:val="24"/>
-          <w:szCs w:val="24"/>
-        </w:rPr>
-        <w:t>Operating</w:t>
-      </w:r>
-      <w:proofErr w:type="spellEnd"/>
-      <w:r>
-        <w:rPr>
-          <w:rFonts w:ascii="Arial" w:hAnsi="Arial" w:cs="Arial"/>
-          <w:i/>
-          <w:iCs/>
-          <w:sz w:val="24"/>
-          <w:szCs w:val="24"/>
-        </w:rPr>
-        <w:t xml:space="preserve"> </w:t>
-      </w:r>
-      <w:proofErr w:type="spellStart"/>
-      <w:r>
-        <w:rPr>
-          <w:rFonts w:ascii="Arial" w:hAnsi="Arial" w:cs="Arial"/>
-          <w:i/>
-          <w:iCs/>
-          <w:sz w:val="24"/>
-          <w:szCs w:val="24"/>
-        </w:rPr>
-        <w:t>Characteristic</w:t>
-      </w:r>
-      <w:proofErr w:type="spellEnd"/>
-      <w:r>
-        <w:rPr>
-          <w:rFonts w:ascii="Arial" w:hAnsi="Arial" w:cs="Arial"/>
-          <w:sz w:val="24"/>
-          <w:szCs w:val="24"/>
-        </w:rPr>
-        <w:t xml:space="preserve">) y AUC (cuando corresponda); </w:t>
-      </w:r>
-      <w:proofErr w:type="spellStart"/>
-      <w:r>
-        <w:rPr>
-          <w:rFonts w:ascii="Arial" w:hAnsi="Arial" w:cs="Arial"/>
-          <w:i/>
-          <w:iCs/>
-          <w:sz w:val="24"/>
-          <w:szCs w:val="24"/>
-        </w:rPr>
-        <w:t>Hamming</w:t>
-      </w:r>
-      <w:proofErr w:type="spellEnd"/>
-      <w:r>
-        <w:rPr>
-          <w:rFonts w:ascii="Arial" w:hAnsi="Arial" w:cs="Arial"/>
-          <w:i/>
-          <w:iCs/>
-          <w:sz w:val="24"/>
-          <w:szCs w:val="24"/>
-        </w:rPr>
-        <w:t xml:space="preserve"> </w:t>
-      </w:r>
-      <w:proofErr w:type="spellStart"/>
-      <w:r>
-        <w:rPr>
-          <w:rFonts w:ascii="Arial" w:hAnsi="Arial" w:cs="Arial"/>
-          <w:i/>
-          <w:iCs/>
-          <w:sz w:val="24"/>
-          <w:szCs w:val="24"/>
-        </w:rPr>
-        <w:t>Loss</w:t>
-      </w:r>
-      <w:proofErr w:type="spellEnd"/>
-      <w:r>
-        <w:rPr>
-          <w:rFonts w:ascii="Arial" w:hAnsi="Arial" w:cs="Arial"/>
-          <w:sz w:val="24"/>
-          <w:szCs w:val="24"/>
-        </w:rPr>
-        <w:t xml:space="preserve"> para experimentos </w:t>
-      </w:r>
-      <w:proofErr w:type="spellStart"/>
-      <w:r>
-        <w:rPr>
-          <w:rFonts w:ascii="Arial" w:hAnsi="Arial" w:cs="Arial"/>
-          <w:sz w:val="24"/>
-          <w:szCs w:val="24"/>
-        </w:rPr>
-        <w:t>multietiqueta</w:t>
-      </w:r>
-      <w:proofErr w:type="spellEnd"/>
-      <w:r>
-        <w:rPr>
-          <w:rFonts w:ascii="Arial" w:hAnsi="Arial" w:cs="Arial"/>
-          <w:sz w:val="24"/>
-          <w:szCs w:val="24"/>
-        </w:rPr>
-        <w:t>.</w:t>
-      </w:r>
-    </w:p>
-    <w:p>
-      <w:pPr>
-        <w:jc w:val="both"/>
-        <w:rPr>
-          <w:rFonts w:ascii="Arial" w:hAnsi="Arial" w:cs="Arial"/>
-          <w:sz w:val="24"/>
-          <w:szCs w:val="24"/>
-        </w:rPr>
-      </w:pPr>
-      <w:r>
-        <w:rPr>
-          <w:rFonts w:ascii="Arial" w:hAnsi="Arial" w:cs="Arial"/>
-          <w:b/>
-          <w:bCs/>
-          <w:sz w:val="24"/>
-          <w:szCs w:val="24"/>
-        </w:rPr>
-        <w:t xml:space="preserve">5- </w:t>
-      </w:r>
-      <w:r>
-        <w:rPr>
-          <w:rFonts w:ascii="Arial" w:hAnsi="Arial" w:cs="Arial"/>
-          <w:b/>
-          <w:bCs/>
-          <w:sz w:val="24"/>
-          <w:szCs w:val="24"/>
-        </w:rPr>
-        <w:t xml:space="preserve">Ablaciones e importancia de </w:t>
+        <w:t xml:space="preserve">5- Ablaciones e importancia de </w:t>
       </w:r>
       <w:r>
         <w:rPr>
@@ -3084,77 +2472,53 @@
         <w:jc w:val="both"/>
         <w:rPr>
           <w:rFonts w:ascii="Arial" w:hAnsi="Arial" w:cs="Arial"/>
-          <w:sz w:val="24"/>
-          <w:szCs w:val="24"/>
-        </w:rPr>
-      </w:pPr>
-      <w:r>
-        <w:rPr>
-          <w:rFonts w:ascii="Arial" w:hAnsi="Arial" w:cs="Arial"/>
-          <w:sz w:val="24"/>
-          <w:szCs w:val="24"/>
-        </w:rPr>
-        <w:t xml:space="preserve">1- </w:t>
-      </w:r>
-      <w:r>
-        <w:rPr>
-          <w:rFonts w:ascii="Arial" w:hAnsi="Arial" w:cs="Arial"/>
-          <w:sz w:val="24"/>
-          <w:szCs w:val="24"/>
-        </w:rPr>
-        <w:t>Integra y compara los escenarios heredados del proyecto base con SR-BH 2020 [Dat20].</w:t>
-      </w:r>
-    </w:p>
-    <w:p>
-      <w:pPr>
-        <w:jc w:val="both"/>
-        <w:rPr>
-          <w:rFonts w:ascii="Arial" w:hAnsi="Arial" w:cs="Arial"/>
-          <w:sz w:val="24"/>
-          <w:szCs w:val="24"/>
-        </w:rPr>
-      </w:pPr>
-      <w:r>
-        <w:rPr>
-          <w:rFonts w:ascii="Arial" w:hAnsi="Arial" w:cs="Arial"/>
-          <w:sz w:val="24"/>
-          <w:szCs w:val="24"/>
-        </w:rPr>
-        <w:t xml:space="preserve">2- </w:t>
-      </w:r>
-      <w:r>
-        <w:rPr>
-          <w:rFonts w:ascii="Arial" w:hAnsi="Arial" w:cs="Arial"/>
-          <w:sz w:val="24"/>
-          <w:szCs w:val="24"/>
-        </w:rPr>
-        <w:t>Aborda la detección y clasificación por tipo de ataque en la capa de aplicación.</w:t>
-      </w:r>
-    </w:p>
-    <w:p>
-      <w:pPr>
-        <w:jc w:val="both"/>
-        <w:rPr>
-          <w:rFonts w:ascii="Arial" w:hAnsi="Arial" w:cs="Arial"/>
-          <w:sz w:val="24"/>
-          <w:szCs w:val="24"/>
-        </w:rPr>
-      </w:pPr>
-      <w:r>
-        <w:rPr>
-          <w:rFonts w:ascii="Arial" w:hAnsi="Arial" w:cs="Arial"/>
-          <w:sz w:val="24"/>
-          <w:szCs w:val="24"/>
-        </w:rPr>
-        <w:t xml:space="preserve">3- </w:t>
-      </w:r>
-      <w:r>
-        <w:rPr>
-          <w:rFonts w:ascii="Arial" w:hAnsi="Arial" w:cs="Arial"/>
-          <w:sz w:val="24"/>
-          <w:szCs w:val="24"/>
-        </w:rPr>
-        <w:t xml:space="preserve">Diseña y evalúa un conjunto de </w:t>
+          <w:sz w:val="28"/>
+          <w:szCs w:val="28"/>
+        </w:rPr>
+      </w:pPr>
+      <w:r>
+        <w:rPr>
+          <w:rFonts w:ascii="Arial" w:hAnsi="Arial" w:cs="Arial"/>
+          <w:sz w:val="24"/>
+          <w:szCs w:val="24"/>
+        </w:rPr>
+        <w:t>1- Integra y compara los escenarios heredados del proyecto base con SR-BH 2020 [7].</w:t>
+      </w:r>
+    </w:p>
+    <w:p>
+      <w:pPr>
+        <w:jc w:val="both"/>
+        <w:rPr>
+          <w:rFonts w:ascii="Arial" w:hAnsi="Arial" w:cs="Arial"/>
+          <w:sz w:val="24"/>
+          <w:szCs w:val="24"/>
+        </w:rPr>
+      </w:pPr>
+      <w:r>
+        <w:rPr>
+          <w:rFonts w:ascii="Arial" w:hAnsi="Arial" w:cs="Arial"/>
+          <w:sz w:val="24"/>
+          <w:szCs w:val="24"/>
+        </w:rPr>
+        <w:t>2- Aborda la detección y clasificación por tipo de ataque en la capa de aplicación.</w:t>
+      </w:r>
+    </w:p>
+    <w:p>
+      <w:pPr>
+        <w:jc w:val="both"/>
+        <w:rPr>
+          <w:rFonts w:ascii="Arial" w:hAnsi="Arial" w:cs="Arial"/>
+          <w:sz w:val="24"/>
+          <w:szCs w:val="24"/>
+        </w:rPr>
+      </w:pPr>
+      <w:r>
+        <w:rPr>
+          <w:rFonts w:ascii="Arial" w:hAnsi="Arial" w:cs="Arial"/>
+          <w:sz w:val="24"/>
+          <w:szCs w:val="24"/>
+        </w:rPr>
+        <w:t xml:space="preserve">3- Diseña y evalúa un conjunto de </w:t>
       </w:r>
       <w:r>
         <w:rPr>
@@ -3190,16 +2554,7 @@
           <w:sz w:val="24"/>
           <w:szCs w:val="24"/>
         </w:rPr>
-        <w:lastRenderedPageBreak/>
-        <w:t xml:space="preserve">4- </w:t>
-      </w:r>
-      <w:r>
-        <w:rPr>
-          <w:rFonts w:ascii="Arial" w:hAnsi="Arial" w:cs="Arial"/>
-          <w:sz w:val="24"/>
-          <w:szCs w:val="24"/>
-        </w:rPr>
-        <w:t xml:space="preserve">Entrega un prototipo funcional de WAF y resultados reproducibles (código y </w:t>
+        <w:t xml:space="preserve">4- Entrega un prototipo funcional de WAF y resultados reproducibles (código y </w:t>
       </w:r>
       <w:r>
         <w:rPr>
@@ -3313,6 +2668,7 @@
           <w:sz w:val="24"/>
           <w:szCs w:val="24"/>
         </w:rPr>
+        <w:lastRenderedPageBreak/>
         <w:t xml:space="preserve">2- </w:t>
       </w:r>
       <w:r>
@@ -3528,8 +2884,8 @@
         <w:tblLook w:val="04A0" w:firstRow="1" w:lastRow="0" w:firstColumn="1" w:lastColumn="0" w:noHBand="0" w:noVBand="1"/>
       </w:tblPr>
       <w:tblGrid>
-        <w:gridCol w:w="2879"/>
-        <w:gridCol w:w="5615"/>
+        <w:gridCol w:w="3012"/>
+        <w:gridCol w:w="5482"/>
       </w:tblGrid>
       <w:tr>
         <w:trPr>
@@ -3547,7 +2903,7 @@
               <w:spacing w:after="0" w:line="240" w:lineRule="auto"/>
               <w:jc w:val="both"/>
               <w:rPr>
-                <w:rFonts w:ascii="Times New Roman" w:eastAsia="Times New Roman" w:hAnsi="Times New Roman" w:cs="Times New Roman"/>
+                <w:rFonts w:ascii="Arial" w:eastAsia="Times New Roman" w:hAnsi="Arial" w:cs="Arial"/>
                 <w:b/>
                 <w:bCs/>
                 <w:sz w:val="24"/>
@@ -3557,7 +2913,7 @@
             </w:pPr>
             <w:r>
               <w:rPr>
-                <w:rFonts w:ascii="Times New Roman" w:eastAsia="Times New Roman" w:hAnsi="Times New Roman" w:cs="Times New Roman"/>
+                <w:rFonts w:ascii="Arial" w:eastAsia="Times New Roman" w:hAnsi="Arial" w:cs="Arial"/>
                 <w:b/>
                 <w:bCs/>
                 <w:sz w:val="24"/>
@@ -3579,7 +2935,7 @@
               <w:spacing w:after="0" w:line="240" w:lineRule="auto"/>
               <w:jc w:val="both"/>
               <w:rPr>
-                <w:rFonts w:ascii="Times New Roman" w:eastAsia="Times New Roman" w:hAnsi="Times New Roman" w:cs="Times New Roman"/>
+                <w:rFonts w:ascii="Arial" w:eastAsia="Times New Roman" w:hAnsi="Arial" w:cs="Arial"/>
                 <w:b/>
                 <w:bCs/>
                 <w:sz w:val="24"/>
@@ -3589,7 +2945,7 @@
             </w:pPr>
             <w:r>
               <w:rPr>
-                <w:rFonts w:ascii="Times New Roman" w:eastAsia="Times New Roman" w:hAnsi="Times New Roman" w:cs="Times New Roman"/>
+                <w:rFonts w:ascii="Arial" w:eastAsia="Times New Roman" w:hAnsi="Arial" w:cs="Arial"/>
                 <w:b/>
                 <w:bCs/>
                 <w:sz w:val="24"/>
@@ -3616,7 +2972,7 @@
               <w:spacing w:after="0" w:line="240" w:lineRule="auto"/>
               <w:jc w:val="both"/>
               <w:rPr>
-                <w:rFonts w:ascii="Times New Roman" w:eastAsia="Times New Roman" w:hAnsi="Times New Roman" w:cs="Times New Roman"/>
+                <w:rFonts w:ascii="Arial" w:eastAsia="Times New Roman" w:hAnsi="Arial" w:cs="Arial"/>
                 <w:sz w:val="24"/>
                 <w:szCs w:val="24"/>
                 <w:lang w:eastAsia="es-PY"/>
@@ -3624,7 +2980,7 @@
             </w:pPr>
             <w:r>
               <w:rPr>
-                <w:rFonts w:ascii="Times New Roman" w:eastAsia="Times New Roman" w:hAnsi="Times New Roman" w:cs="Times New Roman"/>
+                <w:rFonts w:ascii="Arial" w:eastAsia="Times New Roman" w:hAnsi="Arial" w:cs="Arial"/>
                 <w:sz w:val="24"/>
                 <w:szCs w:val="24"/>
                 <w:lang w:eastAsia="es-PY"/>
@@ -3634,7 +2990,7 @@
             <w:proofErr w:type="spellStart"/>
             <w:r>
               <w:rPr>
-                <w:rFonts w:ascii="Times New Roman" w:eastAsia="Times New Roman" w:hAnsi="Times New Roman" w:cs="Times New Roman"/>
+                <w:rFonts w:ascii="Arial" w:eastAsia="Times New Roman" w:hAnsi="Arial" w:cs="Arial"/>
                 <w:sz w:val="24"/>
                 <w:szCs w:val="24"/>
                 <w:lang w:eastAsia="es-PY"/>
@@ -3644,7 +3000,7 @@
             <w:proofErr w:type="spellEnd"/>
             <w:r>
               <w:rPr>
-                <w:rFonts w:ascii="Times New Roman" w:eastAsia="Times New Roman" w:hAnsi="Times New Roman" w:cs="Times New Roman"/>
+                <w:rFonts w:ascii="Arial" w:eastAsia="Times New Roman" w:hAnsi="Arial" w:cs="Arial"/>
                 <w:sz w:val="24"/>
                 <w:szCs w:val="24"/>
                 <w:lang w:eastAsia="es-PY"/>
@@ -3664,7 +3020,7 @@
               <w:spacing w:after="0" w:line="240" w:lineRule="auto"/>
               <w:jc w:val="both"/>
               <w:rPr>
-                <w:rFonts w:ascii="Times New Roman" w:eastAsia="Times New Roman" w:hAnsi="Times New Roman" w:cs="Times New Roman"/>
+                <w:rFonts w:ascii="Arial" w:eastAsia="Times New Roman" w:hAnsi="Arial" w:cs="Arial"/>
                 <w:sz w:val="24"/>
                 <w:szCs w:val="24"/>
                 <w:lang w:eastAsia="es-PY"/>
@@ -3672,7 +3028,7 @@
             </w:pPr>
             <w:r>
               <w:rPr>
-                <w:rFonts w:ascii="Times New Roman" w:eastAsia="Times New Roman" w:hAnsi="Times New Roman" w:cs="Times New Roman"/>
+                <w:rFonts w:ascii="Arial" w:eastAsia="Times New Roman" w:hAnsi="Arial" w:cs="Arial"/>
                 <w:sz w:val="24"/>
                 <w:szCs w:val="24"/>
                 <w:lang w:eastAsia="es-PY"/>
@@ -3681,7 +3037,7 @@
             </w:r>
             <w:r>
               <w:rPr>
-                <w:rFonts w:ascii="Times New Roman" w:eastAsia="Times New Roman" w:hAnsi="Times New Roman" w:cs="Times New Roman"/>
+                <w:rFonts w:ascii="Arial" w:eastAsia="Times New Roman" w:hAnsi="Arial" w:cs="Arial"/>
                 <w:i/>
                 <w:iCs/>
                 <w:sz w:val="24"/>
@@ -3692,7 +3048,7 @@
             </w:r>
             <w:r>
               <w:rPr>
-                <w:rFonts w:ascii="Times New Roman" w:eastAsia="Times New Roman" w:hAnsi="Times New Roman" w:cs="Times New Roman"/>
+                <w:rFonts w:ascii="Arial" w:eastAsia="Times New Roman" w:hAnsi="Arial" w:cs="Arial"/>
                 <w:sz w:val="24"/>
                 <w:szCs w:val="24"/>
                 <w:lang w:eastAsia="es-PY"/>
@@ -3717,7 +3073,7 @@
               <w:spacing w:after="0" w:line="240" w:lineRule="auto"/>
               <w:jc w:val="both"/>
               <w:rPr>
-                <w:rFonts w:ascii="Times New Roman" w:eastAsia="Times New Roman" w:hAnsi="Times New Roman" w:cs="Times New Roman"/>
+                <w:rFonts w:ascii="Arial" w:eastAsia="Times New Roman" w:hAnsi="Arial" w:cs="Arial"/>
                 <w:sz w:val="24"/>
                 <w:szCs w:val="24"/>
                 <w:lang w:eastAsia="es-PY"/>
@@ -3725,7 +3081,7 @@
             </w:pPr>
             <w:r>
               <w:rPr>
-                <w:rFonts w:ascii="Times New Roman" w:eastAsia="Times New Roman" w:hAnsi="Times New Roman" w:cs="Times New Roman"/>
+                <w:rFonts w:ascii="Arial" w:eastAsia="Times New Roman" w:hAnsi="Arial" w:cs="Arial"/>
                 <w:sz w:val="24"/>
                 <w:szCs w:val="24"/>
                 <w:lang w:eastAsia="es-PY"/>
@@ -3735,7 +3091,7 @@
             <w:proofErr w:type="spellStart"/>
             <w:r>
               <w:rPr>
-                <w:rFonts w:ascii="Times New Roman" w:eastAsia="Times New Roman" w:hAnsi="Times New Roman" w:cs="Times New Roman"/>
+                <w:rFonts w:ascii="Arial" w:eastAsia="Times New Roman" w:hAnsi="Arial" w:cs="Arial"/>
                 <w:sz w:val="24"/>
                 <w:szCs w:val="24"/>
                 <w:lang w:eastAsia="es-PY"/>
@@ -3745,7 +3101,7 @@
             <w:proofErr w:type="spellEnd"/>
             <w:r>
               <w:rPr>
-                <w:rFonts w:ascii="Times New Roman" w:eastAsia="Times New Roman" w:hAnsi="Times New Roman" w:cs="Times New Roman"/>
+                <w:rFonts w:ascii="Arial" w:eastAsia="Times New Roman" w:hAnsi="Arial" w:cs="Arial"/>
                 <w:sz w:val="24"/>
                 <w:szCs w:val="24"/>
                 <w:lang w:eastAsia="es-PY"/>
@@ -3765,7 +3121,7 @@
               <w:spacing w:after="0" w:line="240" w:lineRule="auto"/>
               <w:jc w:val="both"/>
               <w:rPr>
-                <w:rFonts w:ascii="Times New Roman" w:eastAsia="Times New Roman" w:hAnsi="Times New Roman" w:cs="Times New Roman"/>
+                <w:rFonts w:ascii="Arial" w:eastAsia="Times New Roman" w:hAnsi="Arial" w:cs="Arial"/>
                 <w:sz w:val="24"/>
                 <w:szCs w:val="24"/>
                 <w:lang w:eastAsia="es-PY"/>
@@ -3774,7 +3130,7 @@
             <w:proofErr w:type="spellStart"/>
             <w:r>
               <w:rPr>
-                <w:rFonts w:ascii="Times New Roman" w:eastAsia="Times New Roman" w:hAnsi="Times New Roman" w:cs="Times New Roman"/>
+                <w:rFonts w:ascii="Arial" w:eastAsia="Times New Roman" w:hAnsi="Arial" w:cs="Arial"/>
                 <w:sz w:val="24"/>
                 <w:szCs w:val="24"/>
                 <w:lang w:eastAsia="es-PY"/>
@@ -3784,7 +3140,7 @@
             <w:proofErr w:type="spellEnd"/>
             <w:r>
               <w:rPr>
-                <w:rFonts w:ascii="Times New Roman" w:eastAsia="Times New Roman" w:hAnsi="Times New Roman" w:cs="Times New Roman"/>
+                <w:rFonts w:ascii="Arial" w:eastAsia="Times New Roman" w:hAnsi="Arial" w:cs="Arial"/>
                 <w:sz w:val="24"/>
                 <w:szCs w:val="24"/>
                 <w:lang w:eastAsia="es-PY"/>
@@ -3793,7 +3149,7 @@
             </w:r>
             <w:r>
               <w:rPr>
-                <w:rFonts w:ascii="Times New Roman" w:eastAsia="Times New Roman" w:hAnsi="Times New Roman" w:cs="Times New Roman"/>
+                <w:rFonts w:ascii="Arial" w:eastAsia="Times New Roman" w:hAnsi="Arial" w:cs="Arial"/>
                 <w:i/>
                 <w:iCs/>
                 <w:sz w:val="24"/>
@@ -3804,7 +3160,7 @@
             </w:r>
             <w:r>
               <w:rPr>
-                <w:rFonts w:ascii="Times New Roman" w:eastAsia="Times New Roman" w:hAnsi="Times New Roman" w:cs="Times New Roman"/>
+                <w:rFonts w:ascii="Arial" w:eastAsia="Times New Roman" w:hAnsi="Arial" w:cs="Arial"/>
                 <w:sz w:val="24"/>
                 <w:szCs w:val="24"/>
                 <w:lang w:eastAsia="es-PY"/>
@@ -3814,7 +3170,7 @@
             <w:proofErr w:type="spellStart"/>
             <w:r>
               <w:rPr>
-                <w:rFonts w:ascii="Times New Roman" w:eastAsia="Times New Roman" w:hAnsi="Times New Roman" w:cs="Times New Roman"/>
+                <w:rFonts w:ascii="Arial" w:eastAsia="Times New Roman" w:hAnsi="Arial" w:cs="Arial"/>
                 <w:i/>
                 <w:iCs/>
                 <w:sz w:val="24"/>
@@ -3826,7 +3182,7 @@
             <w:proofErr w:type="spellEnd"/>
             <w:r>
               <w:rPr>
-                <w:rFonts w:ascii="Times New Roman" w:eastAsia="Times New Roman" w:hAnsi="Times New Roman" w:cs="Times New Roman"/>
+                <w:rFonts w:ascii="Arial" w:eastAsia="Times New Roman" w:hAnsi="Arial" w:cs="Arial"/>
                 <w:sz w:val="24"/>
                 <w:szCs w:val="24"/>
                 <w:lang w:eastAsia="es-PY"/>
@@ -3851,7 +3207,7 @@
               <w:spacing w:after="0" w:line="240" w:lineRule="auto"/>
               <w:jc w:val="both"/>
               <w:rPr>
-                <w:rFonts w:ascii="Times New Roman" w:eastAsia="Times New Roman" w:hAnsi="Times New Roman" w:cs="Times New Roman"/>
+                <w:rFonts w:ascii="Arial" w:eastAsia="Times New Roman" w:hAnsi="Arial" w:cs="Arial"/>
                 <w:sz w:val="24"/>
                 <w:szCs w:val="24"/>
                 <w:lang w:eastAsia="es-PY"/>
@@ -3859,7 +3215,7 @@
             </w:pPr>
             <w:r>
               <w:rPr>
-                <w:rFonts w:ascii="Times New Roman" w:eastAsia="Times New Roman" w:hAnsi="Times New Roman" w:cs="Times New Roman"/>
+                <w:rFonts w:ascii="Arial" w:eastAsia="Times New Roman" w:hAnsi="Arial" w:cs="Arial"/>
                 <w:sz w:val="24"/>
                 <w:szCs w:val="24"/>
                 <w:lang w:eastAsia="es-PY"/>
@@ -3869,7 +3225,7 @@
             <w:proofErr w:type="spellStart"/>
             <w:r>
               <w:rPr>
-                <w:rFonts w:ascii="Times New Roman" w:eastAsia="Times New Roman" w:hAnsi="Times New Roman" w:cs="Times New Roman"/>
+                <w:rFonts w:ascii="Arial" w:eastAsia="Times New Roman" w:hAnsi="Arial" w:cs="Arial"/>
                 <w:sz w:val="24"/>
                 <w:szCs w:val="24"/>
                 <w:lang w:eastAsia="es-PY"/>
@@ -3879,7 +3235,7 @@
             <w:proofErr w:type="spellEnd"/>
             <w:r>
               <w:rPr>
-                <w:rFonts w:ascii="Times New Roman" w:eastAsia="Times New Roman" w:hAnsi="Times New Roman" w:cs="Times New Roman"/>
+                <w:rFonts w:ascii="Arial" w:eastAsia="Times New Roman" w:hAnsi="Arial" w:cs="Arial"/>
                 <w:sz w:val="24"/>
                 <w:szCs w:val="24"/>
                 <w:lang w:eastAsia="es-PY"/>
@@ -3899,7 +3255,7 @@
               <w:spacing w:after="0" w:line="240" w:lineRule="auto"/>
               <w:jc w:val="both"/>
               <w:rPr>
-                <w:rFonts w:ascii="Times New Roman" w:eastAsia="Times New Roman" w:hAnsi="Times New Roman" w:cs="Times New Roman"/>
+                <w:rFonts w:ascii="Arial" w:eastAsia="Times New Roman" w:hAnsi="Arial" w:cs="Arial"/>
                 <w:sz w:val="24"/>
                 <w:szCs w:val="24"/>
                 <w:lang w:eastAsia="es-PY"/>
@@ -3908,7 +3264,7 @@
             <w:proofErr w:type="spellStart"/>
             <w:r>
               <w:rPr>
-                <w:rFonts w:ascii="Times New Roman" w:eastAsia="Times New Roman" w:hAnsi="Times New Roman" w:cs="Times New Roman"/>
+                <w:rFonts w:ascii="Arial" w:eastAsia="Times New Roman" w:hAnsi="Arial" w:cs="Arial"/>
                 <w:i/>
                 <w:iCs/>
                 <w:sz w:val="24"/>
@@ -3920,7 +3276,7 @@
             <w:proofErr w:type="spellEnd"/>
             <w:r>
               <w:rPr>
-                <w:rFonts w:ascii="Times New Roman" w:eastAsia="Times New Roman" w:hAnsi="Times New Roman" w:cs="Times New Roman"/>
+                <w:rFonts w:ascii="Arial" w:eastAsia="Times New Roman" w:hAnsi="Arial" w:cs="Arial"/>
                 <w:sz w:val="24"/>
                 <w:szCs w:val="24"/>
                 <w:lang w:eastAsia="es-PY"/>
@@ -3930,7 +3286,7 @@
             <w:proofErr w:type="spellStart"/>
             <w:r>
               <w:rPr>
-                <w:rFonts w:ascii="Times New Roman" w:eastAsia="Times New Roman" w:hAnsi="Times New Roman" w:cs="Times New Roman"/>
+                <w:rFonts w:ascii="Arial" w:eastAsia="Times New Roman" w:hAnsi="Arial" w:cs="Arial"/>
                 <w:i/>
                 <w:iCs/>
                 <w:sz w:val="24"/>
@@ -3942,7 +3298,7 @@
             <w:proofErr w:type="spellEnd"/>
             <w:r>
               <w:rPr>
-                <w:rFonts w:ascii="Times New Roman" w:eastAsia="Times New Roman" w:hAnsi="Times New Roman" w:cs="Times New Roman"/>
+                <w:rFonts w:ascii="Arial" w:eastAsia="Times New Roman" w:hAnsi="Arial" w:cs="Arial"/>
                 <w:sz w:val="24"/>
                 <w:szCs w:val="24"/>
                 <w:lang w:eastAsia="es-PY"/>
@@ -3952,7 +3308,7 @@
             <w:proofErr w:type="spellStart"/>
             <w:r>
               <w:rPr>
-                <w:rFonts w:ascii="Times New Roman" w:eastAsia="Times New Roman" w:hAnsi="Times New Roman" w:cs="Times New Roman"/>
+                <w:rFonts w:ascii="Arial" w:eastAsia="Times New Roman" w:hAnsi="Arial" w:cs="Arial"/>
                 <w:sz w:val="24"/>
                 <w:szCs w:val="24"/>
                 <w:lang w:eastAsia="es-PY"/>
@@ -3962,7 +3318,7 @@
             <w:proofErr w:type="spellEnd"/>
             <w:r>
               <w:rPr>
-                <w:rFonts w:ascii="Times New Roman" w:eastAsia="Times New Roman" w:hAnsi="Times New Roman" w:cs="Times New Roman"/>
+                <w:rFonts w:ascii="Arial" w:eastAsia="Times New Roman" w:hAnsi="Arial" w:cs="Arial"/>
                 <w:sz w:val="24"/>
                 <w:szCs w:val="24"/>
                 <w:lang w:eastAsia="es-PY"/>
@@ -3987,7 +3343,7 @@
               <w:spacing w:after="0" w:line="240" w:lineRule="auto"/>
               <w:jc w:val="both"/>
               <w:rPr>
-                <w:rFonts w:ascii="Times New Roman" w:eastAsia="Times New Roman" w:hAnsi="Times New Roman" w:cs="Times New Roman"/>
+                <w:rFonts w:ascii="Arial" w:eastAsia="Times New Roman" w:hAnsi="Arial" w:cs="Arial"/>
                 <w:sz w:val="24"/>
                 <w:szCs w:val="24"/>
                 <w:lang w:eastAsia="es-PY"/>
@@ -3995,7 +3351,7 @@
             </w:pPr>
             <w:r>
               <w:rPr>
-                <w:rFonts w:ascii="Times New Roman" w:eastAsia="Times New Roman" w:hAnsi="Times New Roman" w:cs="Times New Roman"/>
+                <w:rFonts w:ascii="Arial" w:eastAsia="Times New Roman" w:hAnsi="Arial" w:cs="Arial"/>
                 <w:sz w:val="24"/>
                 <w:szCs w:val="24"/>
                 <w:lang w:eastAsia="es-PY"/>
@@ -4005,7 +3361,7 @@
             <w:proofErr w:type="spellStart"/>
             <w:r>
               <w:rPr>
-                <w:rFonts w:ascii="Times New Roman" w:eastAsia="Times New Roman" w:hAnsi="Times New Roman" w:cs="Times New Roman"/>
+                <w:rFonts w:ascii="Arial" w:eastAsia="Times New Roman" w:hAnsi="Arial" w:cs="Arial"/>
                 <w:sz w:val="24"/>
                 <w:szCs w:val="24"/>
                 <w:lang w:eastAsia="es-PY"/>
@@ -4015,7 +3371,7 @@
             <w:proofErr w:type="spellEnd"/>
             <w:r>
               <w:rPr>
-                <w:rFonts w:ascii="Times New Roman" w:eastAsia="Times New Roman" w:hAnsi="Times New Roman" w:cs="Times New Roman"/>
+                <w:rFonts w:ascii="Arial" w:eastAsia="Times New Roman" w:hAnsi="Arial" w:cs="Arial"/>
                 <w:sz w:val="24"/>
                 <w:szCs w:val="24"/>
                 <w:lang w:eastAsia="es-PY"/>
@@ -4035,7 +3391,7 @@
               <w:spacing w:after="0" w:line="240" w:lineRule="auto"/>
               <w:jc w:val="both"/>
               <w:rPr>
-                <w:rFonts w:ascii="Times New Roman" w:eastAsia="Times New Roman" w:hAnsi="Times New Roman" w:cs="Times New Roman"/>
+                <w:rFonts w:ascii="Arial" w:eastAsia="Times New Roman" w:hAnsi="Arial" w:cs="Arial"/>
                 <w:sz w:val="24"/>
                 <w:szCs w:val="24"/>
                 <w:lang w:eastAsia="es-PY"/>
@@ -4043,7 +3399,7 @@
             </w:pPr>
             <w:r>
               <w:rPr>
-                <w:rFonts w:ascii="Times New Roman" w:eastAsia="Times New Roman" w:hAnsi="Times New Roman" w:cs="Times New Roman"/>
+                <w:rFonts w:ascii="Arial" w:eastAsia="Times New Roman" w:hAnsi="Arial" w:cs="Arial"/>
                 <w:sz w:val="24"/>
                 <w:szCs w:val="24"/>
                 <w:lang w:eastAsia="es-PY"/>
@@ -4052,7 +3408,7 @@
             </w:r>
             <w:r>
               <w:rPr>
-                <w:rFonts w:ascii="Times New Roman" w:eastAsia="Times New Roman" w:hAnsi="Times New Roman" w:cs="Times New Roman"/>
+                <w:rFonts w:ascii="Arial" w:eastAsia="Times New Roman" w:hAnsi="Arial" w:cs="Arial"/>
                 <w:i/>
                 <w:iCs/>
                 <w:sz w:val="24"/>
@@ -4063,7 +3419,7 @@
             </w:r>
             <w:r>
               <w:rPr>
-                <w:rFonts w:ascii="Times New Roman" w:eastAsia="Times New Roman" w:hAnsi="Times New Roman" w:cs="Times New Roman"/>
+                <w:rFonts w:ascii="Arial" w:eastAsia="Times New Roman" w:hAnsi="Arial" w:cs="Arial"/>
                 <w:sz w:val="24"/>
                 <w:szCs w:val="24"/>
                 <w:lang w:eastAsia="es-PY"/>
@@ -4073,7 +3429,7 @@
             <w:proofErr w:type="spellStart"/>
             <w:r>
               <w:rPr>
-                <w:rFonts w:ascii="Times New Roman" w:eastAsia="Times New Roman" w:hAnsi="Times New Roman" w:cs="Times New Roman"/>
+                <w:rFonts w:ascii="Arial" w:eastAsia="Times New Roman" w:hAnsi="Arial" w:cs="Arial"/>
                 <w:sz w:val="24"/>
                 <w:szCs w:val="24"/>
                 <w:lang w:eastAsia="es-PY"/>
@@ -4083,7 +3439,7 @@
             <w:proofErr w:type="spellEnd"/>
             <w:r>
               <w:rPr>
-                <w:rFonts w:ascii="Times New Roman" w:eastAsia="Times New Roman" w:hAnsi="Times New Roman" w:cs="Times New Roman"/>
+                <w:rFonts w:ascii="Arial" w:eastAsia="Times New Roman" w:hAnsi="Arial" w:cs="Arial"/>
                 <w:sz w:val="24"/>
                 <w:szCs w:val="24"/>
                 <w:lang w:eastAsia="es-PY"/>
@@ -4108,7 +3464,7 @@
               <w:spacing w:after="0" w:line="240" w:lineRule="auto"/>
               <w:jc w:val="both"/>
               <w:rPr>
-                <w:rFonts w:ascii="Times New Roman" w:eastAsia="Times New Roman" w:hAnsi="Times New Roman" w:cs="Times New Roman"/>
+                <w:rFonts w:ascii="Arial" w:eastAsia="Times New Roman" w:hAnsi="Arial" w:cs="Arial"/>
                 <w:sz w:val="24"/>
                 <w:szCs w:val="24"/>
                 <w:lang w:eastAsia="es-PY"/>
@@ -4116,7 +3472,7 @@
             </w:pPr>
             <w:r>
               <w:rPr>
-                <w:rFonts w:ascii="Times New Roman" w:eastAsia="Times New Roman" w:hAnsi="Times New Roman" w:cs="Times New Roman"/>
+                <w:rFonts w:ascii="Arial" w:eastAsia="Times New Roman" w:hAnsi="Arial" w:cs="Arial"/>
                 <w:sz w:val="24"/>
                 <w:szCs w:val="24"/>
                 <w:lang w:eastAsia="es-PY"/>
@@ -4126,7 +3482,7 @@
             <w:proofErr w:type="spellStart"/>
             <w:r>
               <w:rPr>
-                <w:rFonts w:ascii="Times New Roman" w:eastAsia="Times New Roman" w:hAnsi="Times New Roman" w:cs="Times New Roman"/>
+                <w:rFonts w:ascii="Arial" w:eastAsia="Times New Roman" w:hAnsi="Arial" w:cs="Arial"/>
                 <w:sz w:val="24"/>
                 <w:szCs w:val="24"/>
                 <w:lang w:eastAsia="es-PY"/>
@@ -4136,7 +3492,7 @@
             <w:proofErr w:type="spellEnd"/>
             <w:r>
               <w:rPr>
-                <w:rFonts w:ascii="Times New Roman" w:eastAsia="Times New Roman" w:hAnsi="Times New Roman" w:cs="Times New Roman"/>
+                <w:rFonts w:ascii="Arial" w:eastAsia="Times New Roman" w:hAnsi="Arial" w:cs="Arial"/>
                 <w:sz w:val="24"/>
                 <w:szCs w:val="24"/>
                 <w:lang w:eastAsia="es-PY"/>
@@ -4156,7 +3512,7 @@
               <w:spacing w:after="0" w:line="240" w:lineRule="auto"/>
               <w:jc w:val="both"/>
               <w:rPr>
-                <w:rFonts w:ascii="Times New Roman" w:eastAsia="Times New Roman" w:hAnsi="Times New Roman" w:cs="Times New Roman"/>
+                <w:rFonts w:ascii="Arial" w:eastAsia="Times New Roman" w:hAnsi="Arial" w:cs="Arial"/>
                 <w:sz w:val="24"/>
                 <w:szCs w:val="24"/>
                 <w:lang w:eastAsia="es-PY"/>
@@ -4164,7 +3520,7 @@
             </w:pPr>
             <w:r>
               <w:rPr>
-                <w:rFonts w:ascii="Times New Roman" w:eastAsia="Times New Roman" w:hAnsi="Times New Roman" w:cs="Times New Roman"/>
+                <w:rFonts w:ascii="Arial" w:eastAsia="Times New Roman" w:hAnsi="Arial" w:cs="Arial"/>
                 <w:sz w:val="24"/>
                 <w:szCs w:val="24"/>
                 <w:lang w:eastAsia="es-PY"/>
@@ -4189,7 +3545,7 @@
               <w:spacing w:after="0" w:line="240" w:lineRule="auto"/>
               <w:jc w:val="both"/>
               <w:rPr>
-                <w:rFonts w:ascii="Times New Roman" w:eastAsia="Times New Roman" w:hAnsi="Times New Roman" w:cs="Times New Roman"/>
+                <w:rFonts w:ascii="Arial" w:eastAsia="Times New Roman" w:hAnsi="Arial" w:cs="Arial"/>
                 <w:sz w:val="24"/>
                 <w:szCs w:val="24"/>
                 <w:lang w:eastAsia="es-PY"/>
@@ -4197,7 +3553,7 @@
             </w:pPr>
             <w:r>
               <w:rPr>
-                <w:rFonts w:ascii="Times New Roman" w:eastAsia="Times New Roman" w:hAnsi="Times New Roman" w:cs="Times New Roman"/>
+                <w:rFonts w:ascii="Arial" w:eastAsia="Times New Roman" w:hAnsi="Arial" w:cs="Arial"/>
                 <w:sz w:val="24"/>
                 <w:szCs w:val="24"/>
                 <w:lang w:eastAsia="es-PY"/>
@@ -4207,7 +3563,7 @@
             <w:proofErr w:type="spellStart"/>
             <w:r>
               <w:rPr>
-                <w:rFonts w:ascii="Times New Roman" w:eastAsia="Times New Roman" w:hAnsi="Times New Roman" w:cs="Times New Roman"/>
+                <w:rFonts w:ascii="Arial" w:eastAsia="Times New Roman" w:hAnsi="Arial" w:cs="Arial"/>
                 <w:sz w:val="24"/>
                 <w:szCs w:val="24"/>
                 <w:lang w:eastAsia="es-PY"/>
@@ -4217,7 +3573,7 @@
             <w:proofErr w:type="spellEnd"/>
             <w:r>
               <w:rPr>
-                <w:rFonts w:ascii="Times New Roman" w:eastAsia="Times New Roman" w:hAnsi="Times New Roman" w:cs="Times New Roman"/>
+                <w:rFonts w:ascii="Arial" w:eastAsia="Times New Roman" w:hAnsi="Arial" w:cs="Arial"/>
                 <w:sz w:val="24"/>
                 <w:szCs w:val="24"/>
                 <w:lang w:eastAsia="es-PY"/>
@@ -4237,7 +3593,7 @@
               <w:spacing w:after="0" w:line="240" w:lineRule="auto"/>
               <w:jc w:val="both"/>
               <w:rPr>
-                <w:rFonts w:ascii="Times New Roman" w:eastAsia="Times New Roman" w:hAnsi="Times New Roman" w:cs="Times New Roman"/>
+                <w:rFonts w:ascii="Arial" w:eastAsia="Times New Roman" w:hAnsi="Arial" w:cs="Arial"/>
                 <w:sz w:val="24"/>
                 <w:szCs w:val="24"/>
                 <w:lang w:eastAsia="es-PY"/>
@@ -4245,7 +3601,7 @@
             </w:pPr>
             <w:r>
               <w:rPr>
-                <w:rFonts w:ascii="Times New Roman" w:eastAsia="Times New Roman" w:hAnsi="Times New Roman" w:cs="Times New Roman"/>
+                <w:rFonts w:ascii="Arial" w:eastAsia="Times New Roman" w:hAnsi="Arial" w:cs="Arial"/>
                 <w:sz w:val="24"/>
                 <w:szCs w:val="24"/>
                 <w:lang w:eastAsia="es-PY"/>
@@ -4305,1253 +3661,166 @@
       <w:pPr>
         <w:pStyle w:val="NormalWeb"/>
         <w:jc w:val="both"/>
-      </w:pPr>
-      <w:r>
-        <w:t xml:space="preserve">[BG16] Anna L. </w:t>
-      </w:r>
-      <w:proofErr w:type="spellStart"/>
-      <w:r>
-        <w:t>Buczak</w:t>
-      </w:r>
-      <w:proofErr w:type="spellEnd"/>
-      <w:r>
-        <w:t xml:space="preserve"> and </w:t>
-      </w:r>
-      <w:proofErr w:type="spellStart"/>
-      <w:r>
-        <w:t>Erhan</w:t>
-      </w:r>
-      <w:proofErr w:type="spellEnd"/>
-      <w:r>
-        <w:t xml:space="preserve"> </w:t>
-      </w:r>
-      <w:proofErr w:type="spellStart"/>
-      <w:r>
-        <w:t>Guven</w:t>
-      </w:r>
-      <w:proofErr w:type="spellEnd"/>
-      <w:r>
-        <w:t xml:space="preserve">. A </w:t>
-      </w:r>
-      <w:proofErr w:type="spellStart"/>
-      <w:r>
-        <w:t>survey</w:t>
-      </w:r>
-      <w:proofErr w:type="spellEnd"/>
-      <w:r>
-        <w:t xml:space="preserve"> </w:t>
-      </w:r>
-      <w:proofErr w:type="spellStart"/>
-      <w:r>
-        <w:t>of</w:t>
-      </w:r>
-      <w:proofErr w:type="spellEnd"/>
-      <w:r>
-        <w:t xml:space="preserve"> data </w:t>
-      </w:r>
-      <w:proofErr w:type="spellStart"/>
-      <w:r>
-        <w:t>mining</w:t>
-      </w:r>
-      <w:proofErr w:type="spellEnd"/>
-      <w:r>
-        <w:t xml:space="preserve"> and machine </w:t>
-      </w:r>
-      <w:proofErr w:type="spellStart"/>
-      <w:r>
-        <w:t>learning</w:t>
-      </w:r>
-      <w:proofErr w:type="spellEnd"/>
-      <w:r>
-        <w:t xml:space="preserve"> </w:t>
-      </w:r>
-      <w:proofErr w:type="spellStart"/>
-      <w:r>
-        <w:t>methods</w:t>
-      </w:r>
-      <w:proofErr w:type="spellEnd"/>
-      <w:r>
-        <w:t xml:space="preserve"> </w:t>
-      </w:r>
-      <w:proofErr w:type="spellStart"/>
-      <w:r>
-        <w:t>for</w:t>
-      </w:r>
-      <w:proofErr w:type="spellEnd"/>
-      <w:r>
-        <w:t xml:space="preserve"> </w:t>
-      </w:r>
-      <w:proofErr w:type="spellStart"/>
-      <w:r>
-        <w:t>cyber</w:t>
-      </w:r>
-      <w:proofErr w:type="spellEnd"/>
-      <w:r>
-        <w:t xml:space="preserve"> </w:t>
-      </w:r>
-      <w:proofErr w:type="spellStart"/>
-      <w:r>
-        <w:t>security</w:t>
-      </w:r>
-      <w:proofErr w:type="spellEnd"/>
-      <w:r>
-        <w:t xml:space="preserve"> </w:t>
-      </w:r>
-      <w:proofErr w:type="spellStart"/>
-      <w:r>
-        <w:t>intrusion</w:t>
-      </w:r>
-      <w:proofErr w:type="spellEnd"/>
-      <w:r>
-        <w:t xml:space="preserve"> </w:t>
-      </w:r>
-      <w:proofErr w:type="spellStart"/>
-      <w:r>
-        <w:t>detection</w:t>
-      </w:r>
-      <w:proofErr w:type="spellEnd"/>
-      <w:r>
-        <w:t xml:space="preserve">. IEEE </w:t>
-      </w:r>
-      <w:proofErr w:type="spellStart"/>
-      <w:r>
-        <w:t>Communications</w:t>
-      </w:r>
-      <w:proofErr w:type="spellEnd"/>
-      <w:r>
-        <w:t xml:space="preserve"> </w:t>
-      </w:r>
-      <w:proofErr w:type="spellStart"/>
-      <w:r>
-        <w:t>Surveys</w:t>
-      </w:r>
-      <w:proofErr w:type="spellEnd"/>
-      <w:r>
-        <w:t xml:space="preserve"> &amp; </w:t>
-      </w:r>
-      <w:proofErr w:type="spellStart"/>
-      <w:r>
-        <w:t>Tutorials</w:t>
-      </w:r>
-      <w:proofErr w:type="spellEnd"/>
-      <w:r>
-        <w:t>, 2016. 1</w:t>
+        <w:rPr>
+          <w:rFonts w:ascii="Arial" w:hAnsi="Arial" w:cs="Arial"/>
+        </w:rPr>
+      </w:pPr>
+      <w:r>
+        <w:rPr>
+          <w:rFonts w:ascii="Arial" w:hAnsi="Arial" w:cs="Arial"/>
+        </w:rPr>
+        <w:t>[1] Carmen Giménez, Alejandro Pérez, and Gonzalo Álvarez. Trabajo final (base del proyecto Nico Ralf). , 2015. Accessed: 2025-09-16.</w:t>
       </w:r>
     </w:p>
     <w:p>
       <w:pPr>
         <w:pStyle w:val="NormalWeb"/>
         <w:jc w:val="both"/>
-      </w:pPr>
-      <w:r>
-        <w:t xml:space="preserve">[Dat20] Harvard </w:t>
-      </w:r>
-      <w:proofErr w:type="spellStart"/>
-      <w:r>
-        <w:t>Dataverse</w:t>
-      </w:r>
-      <w:proofErr w:type="spellEnd"/>
-      <w:r>
-        <w:t xml:space="preserve">. HTTP </w:t>
-      </w:r>
-      <w:proofErr w:type="spellStart"/>
-      <w:r>
-        <w:t>anomalous</w:t>
-      </w:r>
-      <w:proofErr w:type="spellEnd"/>
-      <w:r>
-        <w:t xml:space="preserve"> </w:t>
-      </w:r>
-      <w:proofErr w:type="spellStart"/>
-      <w:r>
-        <w:t>traffic</w:t>
-      </w:r>
-      <w:proofErr w:type="spellEnd"/>
-      <w:r>
-        <w:t xml:space="preserve"> </w:t>
-      </w:r>
-      <w:proofErr w:type="spellStart"/>
-      <w:r>
-        <w:t>dataset</w:t>
-      </w:r>
-      <w:proofErr w:type="spellEnd"/>
-      <w:r>
-        <w:t xml:space="preserve">. https://dataverse.harvard.edu/dataset.xhtml?persistentId=doi:10.7910/DVN/OGOIXX, 2020. </w:t>
-      </w:r>
-      <w:proofErr w:type="spellStart"/>
-      <w:r>
-        <w:t>Accessed</w:t>
-      </w:r>
-      <w:proofErr w:type="spellEnd"/>
-      <w:r>
-        <w:t>: 2025-09-16. 2, 3</w:t>
+        <w:rPr>
+          <w:rFonts w:ascii="Arial" w:hAnsi="Arial" w:cs="Arial"/>
+        </w:rPr>
+      </w:pPr>
+      <w:r>
+        <w:rPr>
+          <w:rFonts w:ascii="Arial" w:hAnsi="Arial" w:cs="Arial"/>
+        </w:rPr>
+        <w:t>[2] Anna L. Buczak and Erhan Guven. A survey of data mining and machine learning methods for cyber security intrusion detection. IEEE Communications Surveys &amp; Tutorials, 2016.</w:t>
       </w:r>
     </w:p>
     <w:p>
       <w:pPr>
         <w:pStyle w:val="NormalWeb"/>
         <w:jc w:val="both"/>
-      </w:pPr>
-      <w:r>
-        <w:t xml:space="preserve">[FWY+24] </w:t>
-      </w:r>
-      <w:proofErr w:type="spellStart"/>
-      <w:r>
-        <w:t>Menghao</w:t>
-      </w:r>
-      <w:proofErr w:type="spellEnd"/>
-      <w:r>
-        <w:t xml:space="preserve"> </w:t>
-      </w:r>
-      <w:proofErr w:type="spellStart"/>
-      <w:r>
-        <w:t>Fang</w:t>
-      </w:r>
-      <w:proofErr w:type="spellEnd"/>
-      <w:r>
-        <w:t xml:space="preserve">, </w:t>
-      </w:r>
-      <w:proofErr w:type="spellStart"/>
-      <w:r>
-        <w:t>Yixiang</w:t>
-      </w:r>
-      <w:proofErr w:type="spellEnd"/>
-      <w:r>
-        <w:t xml:space="preserve"> Wang, </w:t>
-      </w:r>
-      <w:proofErr w:type="spellStart"/>
-      <w:r>
-        <w:t>Liangbin</w:t>
-      </w:r>
-      <w:proofErr w:type="spellEnd"/>
-      <w:r>
-        <w:t xml:space="preserve"> Yang, </w:t>
-      </w:r>
-      <w:proofErr w:type="spellStart"/>
-      <w:r>
-        <w:t>Haorui</w:t>
-      </w:r>
-      <w:proofErr w:type="spellEnd"/>
-      <w:r>
-        <w:t xml:space="preserve"> Wu, </w:t>
-      </w:r>
-      <w:proofErr w:type="spellStart"/>
-      <w:r>
-        <w:t>Zilin</w:t>
-      </w:r>
-      <w:proofErr w:type="spellEnd"/>
-      <w:r>
-        <w:t xml:space="preserve"> Yin, </w:t>
-      </w:r>
-      <w:proofErr w:type="spellStart"/>
-      <w:r>
-        <w:t>Xiang</w:t>
-      </w:r>
-      <w:proofErr w:type="spellEnd"/>
-      <w:r>
-        <w:t xml:space="preserve"> Liu, </w:t>
-      </w:r>
-      <w:proofErr w:type="spellStart"/>
-      <w:r>
-        <w:t>Zexian</w:t>
-      </w:r>
-      <w:proofErr w:type="spellEnd"/>
-      <w:r>
-        <w:t xml:space="preserve"> </w:t>
-      </w:r>
-      <w:proofErr w:type="spellStart"/>
-      <w:r>
-        <w:t>Xie</w:t>
-      </w:r>
-      <w:proofErr w:type="spellEnd"/>
-      <w:r>
-        <w:t xml:space="preserve">, and </w:t>
-      </w:r>
-      <w:proofErr w:type="spellStart"/>
-      <w:r>
-        <w:t>Zixiao</w:t>
-      </w:r>
-      <w:proofErr w:type="spellEnd"/>
-      <w:r>
-        <w:t xml:space="preserve"> Kong. </w:t>
-      </w:r>
-      <w:proofErr w:type="spellStart"/>
-      <w:r>
-        <w:t>Reinventing</w:t>
-      </w:r>
-      <w:proofErr w:type="spellEnd"/>
-      <w:r>
-        <w:t xml:space="preserve"> web </w:t>
-      </w:r>
-      <w:proofErr w:type="spellStart"/>
-      <w:r>
-        <w:t>security</w:t>
-      </w:r>
-      <w:proofErr w:type="spellEnd"/>
-      <w:r>
-        <w:t xml:space="preserve">: </w:t>
-      </w:r>
-      <w:proofErr w:type="spellStart"/>
-      <w:r>
-        <w:t>An</w:t>
-      </w:r>
-      <w:proofErr w:type="spellEnd"/>
-      <w:r>
-        <w:t xml:space="preserve"> </w:t>
-      </w:r>
-      <w:proofErr w:type="spellStart"/>
-      <w:r>
-        <w:t>enhanced</w:t>
-      </w:r>
-      <w:proofErr w:type="spellEnd"/>
-      <w:r>
-        <w:t xml:space="preserve"> </w:t>
-      </w:r>
-      <w:proofErr w:type="spellStart"/>
-      <w:r>
-        <w:t>cycle-</w:t>
-      </w:r>
-      <w:r>
+        <w:rPr>
+          <w:rFonts w:ascii="Arial" w:hAnsi="Arial" w:cs="Arial"/>
+        </w:rPr>
+      </w:pPr>
+      <w:r>
+        <w:rPr>
+          <w:rFonts w:ascii="Arial" w:hAnsi="Arial" w:cs="Arial"/>
+        </w:rPr>
+        <w:t>[3] Christopher Kruegel and Giovanni Vigna. Anomaly detection of web-based attacks. In Proceedings of the 10th ACM Conference on Computer and Communications Security. ACM, 2003.</w:t>
+      </w:r>
+    </w:p>
+    <w:p>
+      <w:pPr>
+        <w:pStyle w:val="NormalWeb"/>
+        <w:jc w:val="both"/>
+        <w:rPr>
+          <w:rFonts w:ascii="Arial" w:hAnsi="Arial" w:cs="Arial"/>
+        </w:rPr>
+      </w:pPr>
+      <w:r>
+        <w:rPr>
+          <w:rFonts w:ascii="Arial" w:hAnsi="Arial" w:cs="Arial"/>
+        </w:rPr>
+        <w:t>[4] H. Nguyen et al. Application anomaly detection: Taxonomy, methods and systems. ACM Computing Surveys, 2011.</w:t>
+      </w:r>
+    </w:p>
+    <w:p>
+      <w:pPr>
+        <w:pStyle w:val="NormalWeb"/>
+        <w:jc w:val="both"/>
+        <w:rPr>
+          <w:rFonts w:ascii="Arial" w:hAnsi="Arial" w:cs="Arial"/>
+        </w:rPr>
+      </w:pPr>
+      <w:r>
+        <w:rPr>
+          <w:rFonts w:ascii="Arial" w:hAnsi="Arial" w:cs="Arial"/>
+        </w:rPr>
+        <w:t>[5] Shehroz S. Khan and Michael G. Madden. A survey of recent trends in one-class classification. In Irish Conference on Artificial Intelligence and Cognitive Science. Springer Berlin Heidelberg, 2009.</w:t>
+      </w:r>
+    </w:p>
+    <w:p>
+      <w:pPr>
+        <w:pStyle w:val="NormalWeb"/>
+        <w:jc w:val="both"/>
+        <w:rPr>
+          <w:rFonts w:ascii="Arial" w:hAnsi="Arial" w:cs="Arial"/>
+        </w:rPr>
+      </w:pPr>
+      <w:r>
+        <w:rPr>
+          <w:rFonts w:ascii="Arial" w:hAnsi="Arial" w:cs="Arial"/>
+        </w:rPr>
         <w:lastRenderedPageBreak/>
-        <w:t>consistent</w:t>
-      </w:r>
-      <w:proofErr w:type="spellEnd"/>
-      <w:r>
-        <w:t xml:space="preserve"> generative adversarial </w:t>
-      </w:r>
-      <w:proofErr w:type="spellStart"/>
-      <w:r>
-        <w:t>network</w:t>
-      </w:r>
-      <w:proofErr w:type="spellEnd"/>
-      <w:r>
-        <w:t xml:space="preserve"> </w:t>
-      </w:r>
-      <w:proofErr w:type="spellStart"/>
-      <w:r>
-        <w:t>approach</w:t>
-      </w:r>
-      <w:proofErr w:type="spellEnd"/>
-      <w:r>
-        <w:t xml:space="preserve"> </w:t>
-      </w:r>
-      <w:proofErr w:type="spellStart"/>
-      <w:r>
-        <w:t>to</w:t>
-      </w:r>
-      <w:proofErr w:type="spellEnd"/>
-      <w:r>
-        <w:t xml:space="preserve"> </w:t>
-      </w:r>
-      <w:proofErr w:type="spellStart"/>
-      <w:r>
-        <w:t>intrusion</w:t>
-      </w:r>
-      <w:proofErr w:type="spellEnd"/>
-      <w:r>
-        <w:t xml:space="preserve"> </w:t>
-      </w:r>
-      <w:proofErr w:type="spellStart"/>
-      <w:r>
-        <w:t>detection</w:t>
-      </w:r>
-      <w:proofErr w:type="spellEnd"/>
-      <w:r>
-        <w:t xml:space="preserve">. </w:t>
-      </w:r>
-      <w:proofErr w:type="spellStart"/>
-      <w:r>
-        <w:t>Electronics</w:t>
-      </w:r>
-      <w:proofErr w:type="spellEnd"/>
-      <w:r>
-        <w:t>, 13(9):1711, 2024.</w:t>
+        <w:t>[6] Elham Parhizkar and Mahdi Abadi. OC-WAD: A one-class classifier ensemble approach for anomaly detection in web traffic. In 2015 23rd Iranian Conference on Electrical Engineering (ICEE). IEEE, 2015.</w:t>
       </w:r>
     </w:p>
     <w:p>
       <w:pPr>
         <w:pStyle w:val="NormalWeb"/>
         <w:jc w:val="both"/>
-      </w:pPr>
-      <w:r>
-        <w:t xml:space="preserve">[GP5] Carmen Giménez, Alejandro Pérez, and Gonzalo Álvarez. Trabajo final (base del proyecto Nico Ralf). </w:t>
-      </w:r>
-      <w:hyperlink r:id="rId8" w:tgtFrame="_new" w:history="1">
-        <w:r>
-          <w:rPr>
-            <w:rStyle w:val="Hipervnculo"/>
-          </w:rPr>
-          <w:t>https://github.com/nico-ralf-ii-fpuna/tfg/</w:t>
-        </w:r>
-      </w:hyperlink>
-      <w:r>
-        <w:t xml:space="preserve">, 2015. </w:t>
-      </w:r>
-      <w:proofErr w:type="spellStart"/>
-      <w:r>
-        <w:t>Accessed</w:t>
-      </w:r>
-      <w:proofErr w:type="spellEnd"/>
-      <w:r>
-        <w:t>: 2025-09-16. 1, 2</w:t>
+        <w:rPr>
+          <w:rFonts w:ascii="Arial" w:hAnsi="Arial" w:cs="Arial"/>
+        </w:rPr>
+      </w:pPr>
+      <w:r>
+        <w:rPr>
+          <w:rFonts w:ascii="Arial" w:hAnsi="Arial" w:cs="Arial"/>
+        </w:rPr>
+        <w:t>[7] Harvard Dataverse. HTTP anomalous traffic dataset. https://dataverse.harvard.edu/dataset.xhtml?persistentId=doi:10.7910/DVN/OGOIXX, 2020. Accessed: 2025-09-16.</w:t>
       </w:r>
     </w:p>
     <w:p>
       <w:pPr>
         <w:pStyle w:val="NormalWeb"/>
         <w:jc w:val="both"/>
-      </w:pPr>
-      <w:r>
-        <w:t xml:space="preserve">[KM09] </w:t>
-      </w:r>
-      <w:proofErr w:type="spellStart"/>
-      <w:r>
-        <w:t>Shehroz</w:t>
-      </w:r>
-      <w:proofErr w:type="spellEnd"/>
-      <w:r>
-        <w:t xml:space="preserve"> S. Khan and Michael G. Madden. A </w:t>
-      </w:r>
-      <w:proofErr w:type="spellStart"/>
-      <w:r>
-        <w:t>survey</w:t>
-      </w:r>
-      <w:proofErr w:type="spellEnd"/>
-      <w:r>
-        <w:t xml:space="preserve"> </w:t>
-      </w:r>
-      <w:proofErr w:type="spellStart"/>
-      <w:r>
-        <w:t>of</w:t>
-      </w:r>
-      <w:proofErr w:type="spellEnd"/>
-      <w:r>
-        <w:t xml:space="preserve"> </w:t>
-      </w:r>
-      <w:proofErr w:type="spellStart"/>
-      <w:r>
-        <w:t>recent</w:t>
-      </w:r>
-      <w:proofErr w:type="spellEnd"/>
-      <w:r>
-        <w:t xml:space="preserve"> </w:t>
-      </w:r>
-      <w:proofErr w:type="spellStart"/>
-      <w:r>
-        <w:t>trends</w:t>
-      </w:r>
-      <w:proofErr w:type="spellEnd"/>
-      <w:r>
-        <w:t xml:space="preserve"> in </w:t>
-      </w:r>
-      <w:proofErr w:type="spellStart"/>
-      <w:r>
-        <w:t>one-class</w:t>
-      </w:r>
-      <w:proofErr w:type="spellEnd"/>
-      <w:r>
-        <w:t xml:space="preserve"> </w:t>
-      </w:r>
-      <w:proofErr w:type="spellStart"/>
-      <w:r>
-        <w:t>classification</w:t>
-      </w:r>
-      <w:proofErr w:type="spellEnd"/>
-      <w:r>
-        <w:t xml:space="preserve">. In </w:t>
-      </w:r>
-      <w:proofErr w:type="spellStart"/>
-      <w:r>
-        <w:t>Irish</w:t>
-      </w:r>
-      <w:proofErr w:type="spellEnd"/>
-      <w:r>
-        <w:t xml:space="preserve"> </w:t>
-      </w:r>
-      <w:proofErr w:type="spellStart"/>
-      <w:r>
-        <w:t>Conference</w:t>
-      </w:r>
-      <w:proofErr w:type="spellEnd"/>
-      <w:r>
-        <w:t xml:space="preserve"> </w:t>
-      </w:r>
-      <w:proofErr w:type="spellStart"/>
-      <w:r>
-        <w:t>on</w:t>
-      </w:r>
-      <w:proofErr w:type="spellEnd"/>
-      <w:r>
-        <w:t xml:space="preserve"> Artificial </w:t>
-      </w:r>
-      <w:proofErr w:type="spellStart"/>
-      <w:r>
-        <w:t>Intelligence</w:t>
-      </w:r>
-      <w:proofErr w:type="spellEnd"/>
-      <w:r>
-        <w:t xml:space="preserve"> and Cognitive </w:t>
-      </w:r>
-      <w:proofErr w:type="spellStart"/>
-      <w:r>
-        <w:t>Science</w:t>
-      </w:r>
-      <w:proofErr w:type="spellEnd"/>
-      <w:r>
-        <w:t xml:space="preserve">. Springer </w:t>
-      </w:r>
-      <w:proofErr w:type="spellStart"/>
-      <w:r>
-        <w:t>Berlin</w:t>
-      </w:r>
-      <w:proofErr w:type="spellEnd"/>
-      <w:r>
-        <w:t xml:space="preserve"> Heidelberg, 2009. 1</w:t>
+        <w:rPr>
+          <w:rFonts w:ascii="Arial" w:hAnsi="Arial" w:cs="Arial"/>
+        </w:rPr>
+      </w:pPr>
+      <w:r>
+        <w:rPr>
+          <w:rFonts w:ascii="Arial" w:hAnsi="Arial" w:cs="Arial"/>
+        </w:rPr>
+        <w:t>[8] Tomás Sureda Riera, Juan Ramón Bermejo Higuera, Javier Bermejo-Higuera, José Javier Martínez Herraiz, and Juan Antonio Sicilia. A new multi-label dataset for web attacks CAPEC classification using machine learning techniques. Computers &amp; Security, 120:102788, 2022.</w:t>
       </w:r>
     </w:p>
     <w:p>
       <w:pPr>
         <w:pStyle w:val="NormalWeb"/>
         <w:jc w:val="both"/>
-      </w:pPr>
-      <w:r>
-        <w:t xml:space="preserve">[KV03] Christopher </w:t>
-      </w:r>
-      <w:proofErr w:type="spellStart"/>
-      <w:r>
-        <w:t>Kruegel</w:t>
-      </w:r>
-      <w:proofErr w:type="spellEnd"/>
-      <w:r>
-        <w:t xml:space="preserve"> and Giovanni Vigna. </w:t>
-      </w:r>
-      <w:proofErr w:type="spellStart"/>
-      <w:r>
-        <w:t>Anomaly</w:t>
-      </w:r>
-      <w:proofErr w:type="spellEnd"/>
-      <w:r>
-        <w:t xml:space="preserve"> </w:t>
-      </w:r>
-      <w:proofErr w:type="spellStart"/>
-      <w:r>
-        <w:t>detection</w:t>
-      </w:r>
-      <w:proofErr w:type="spellEnd"/>
-      <w:r>
-        <w:t xml:space="preserve"> </w:t>
-      </w:r>
-      <w:proofErr w:type="spellStart"/>
-      <w:r>
-        <w:t>of</w:t>
-      </w:r>
-      <w:proofErr w:type="spellEnd"/>
-      <w:r>
-        <w:t xml:space="preserve"> web-</w:t>
-      </w:r>
-      <w:proofErr w:type="spellStart"/>
-      <w:r>
-        <w:t>based</w:t>
-      </w:r>
-      <w:proofErr w:type="spellEnd"/>
-      <w:r>
-        <w:t xml:space="preserve"> </w:t>
-      </w:r>
-      <w:proofErr w:type="spellStart"/>
-      <w:r>
-        <w:t>attacks</w:t>
-      </w:r>
-      <w:proofErr w:type="spellEnd"/>
-      <w:r>
-        <w:t xml:space="preserve">. In </w:t>
-      </w:r>
-      <w:proofErr w:type="spellStart"/>
-      <w:r>
-        <w:t>Proceedings</w:t>
-      </w:r>
-      <w:proofErr w:type="spellEnd"/>
-      <w:r>
-        <w:t xml:space="preserve"> </w:t>
-      </w:r>
-      <w:proofErr w:type="spellStart"/>
-      <w:r>
-        <w:t>of</w:t>
-      </w:r>
-      <w:proofErr w:type="spellEnd"/>
-      <w:r>
-        <w:t xml:space="preserve"> </w:t>
-      </w:r>
-      <w:proofErr w:type="spellStart"/>
-      <w:r>
-        <w:t>the</w:t>
-      </w:r>
-      <w:proofErr w:type="spellEnd"/>
-      <w:r>
-        <w:t xml:space="preserve"> 10th ACM </w:t>
-      </w:r>
-      <w:proofErr w:type="spellStart"/>
-      <w:r>
-        <w:t>Conference</w:t>
-      </w:r>
-      <w:proofErr w:type="spellEnd"/>
-      <w:r>
-        <w:t xml:space="preserve"> </w:t>
-      </w:r>
-      <w:proofErr w:type="spellStart"/>
-      <w:r>
-        <w:t>on</w:t>
-      </w:r>
-      <w:proofErr w:type="spellEnd"/>
-      <w:r>
-        <w:t xml:space="preserve"> </w:t>
-      </w:r>
-      <w:proofErr w:type="spellStart"/>
-      <w:r>
-        <w:t>Computer</w:t>
-      </w:r>
-      <w:proofErr w:type="spellEnd"/>
-      <w:r>
-        <w:t xml:space="preserve"> and </w:t>
-      </w:r>
-      <w:proofErr w:type="spellStart"/>
-      <w:r>
-        <w:t>Communications</w:t>
-      </w:r>
-      <w:proofErr w:type="spellEnd"/>
-      <w:r>
-        <w:t xml:space="preserve"> Security. ACM, 2003. 1</w:t>
+        <w:rPr>
+          <w:rFonts w:ascii="Arial" w:hAnsi="Arial" w:cs="Arial"/>
+        </w:rPr>
+      </w:pPr>
+      <w:r>
+        <w:rPr>
+          <w:rFonts w:ascii="Arial" w:hAnsi="Arial" w:cs="Arial"/>
+        </w:rPr>
+        <w:t>[9] Amanda Riverol, Gustavo Betarte, Rodrigo Martínez, and Álvaro Pardo. Capturing the security expert knowledge in feature selection for web application attack detection. In Proceedings of the Latin-American Symposium on Dependable Computing (LADC 2024), pages 153–158, 2024. Preprint disponible también como arXiv:2407.18445.</w:t>
       </w:r>
     </w:p>
     <w:p>
       <w:pPr>
         <w:pStyle w:val="NormalWeb"/>
         <w:jc w:val="both"/>
-      </w:pPr>
-      <w:r>
-        <w:t xml:space="preserve">[N+11] H. Nguyen et al. </w:t>
-      </w:r>
-      <w:proofErr w:type="spellStart"/>
-      <w:r>
-        <w:t>Application</w:t>
-      </w:r>
-      <w:proofErr w:type="spellEnd"/>
-      <w:r>
-        <w:t xml:space="preserve"> </w:t>
-      </w:r>
-      <w:proofErr w:type="spellStart"/>
-      <w:r>
-        <w:t>anomaly</w:t>
-      </w:r>
-      <w:proofErr w:type="spellEnd"/>
-      <w:r>
-        <w:t xml:space="preserve"> </w:t>
-      </w:r>
-      <w:proofErr w:type="spellStart"/>
-      <w:r>
-        <w:t>detection</w:t>
-      </w:r>
-      <w:proofErr w:type="spellEnd"/>
-      <w:r>
-        <w:t xml:space="preserve">: </w:t>
-      </w:r>
-      <w:proofErr w:type="spellStart"/>
-      <w:r>
-        <w:t>Taxonomy</w:t>
-      </w:r>
-      <w:proofErr w:type="spellEnd"/>
-      <w:r>
-        <w:t xml:space="preserve">, </w:t>
-      </w:r>
-      <w:proofErr w:type="spellStart"/>
-      <w:r>
-        <w:t>methods</w:t>
-      </w:r>
-      <w:proofErr w:type="spellEnd"/>
-      <w:r>
-        <w:t xml:space="preserve"> and </w:t>
-      </w:r>
-      <w:proofErr w:type="spellStart"/>
-      <w:r>
-        <w:t>systems</w:t>
-      </w:r>
-      <w:proofErr w:type="spellEnd"/>
-      <w:r>
-        <w:t xml:space="preserve">. ACM Computing </w:t>
-      </w:r>
-      <w:proofErr w:type="spellStart"/>
-      <w:r>
-        <w:t>Surveys</w:t>
-      </w:r>
-      <w:proofErr w:type="spellEnd"/>
-      <w:r>
-        <w:t>, 2011. 1</w:t>
+        <w:rPr>
+          <w:rFonts w:ascii="Arial" w:hAnsi="Arial" w:cs="Arial"/>
+        </w:rPr>
+      </w:pPr>
+      <w:r>
+        <w:rPr>
+          <w:rFonts w:ascii="Arial" w:hAnsi="Arial" w:cs="Arial"/>
+        </w:rPr>
+        <w:t>[10] Menghao Fang, Yixiang Wang, Liangbin Yang, Haorui Wu, Zilin Yin, Xiang Liu, Zexian Xie, and Zixiao Kong. Reinventing web security: An enhanced cycle-consistent generative adversarial network approach to intrusion detection. Electronics, 13(9):1711, 2024.</w:t>
       </w:r>
     </w:p>
     <w:p>
       <w:pPr>
         <w:pStyle w:val="NormalWeb"/>
         <w:jc w:val="both"/>
-      </w:pPr>
-      <w:r>
-        <w:t xml:space="preserve">[PA15] </w:t>
-      </w:r>
-      <w:proofErr w:type="spellStart"/>
-      <w:r>
-        <w:t>Elham</w:t>
-      </w:r>
-      <w:proofErr w:type="spellEnd"/>
-      <w:r>
-        <w:t xml:space="preserve"> </w:t>
-      </w:r>
-      <w:proofErr w:type="spellStart"/>
-      <w:r>
-        <w:t>Parhizkar</w:t>
-      </w:r>
-      <w:proofErr w:type="spellEnd"/>
-      <w:r>
-        <w:t xml:space="preserve"> and </w:t>
-      </w:r>
-      <w:proofErr w:type="spellStart"/>
-      <w:r>
-        <w:t>Mahdi</w:t>
-      </w:r>
-      <w:proofErr w:type="spellEnd"/>
-      <w:r>
-        <w:t xml:space="preserve"> </w:t>
-      </w:r>
-      <w:proofErr w:type="spellStart"/>
-      <w:r>
-        <w:t>Abadi</w:t>
-      </w:r>
-      <w:proofErr w:type="spellEnd"/>
-      <w:r>
-        <w:t xml:space="preserve">. OC-WAD: A </w:t>
-      </w:r>
-      <w:proofErr w:type="spellStart"/>
-      <w:r>
-        <w:t>one-class</w:t>
-      </w:r>
-      <w:proofErr w:type="spellEnd"/>
-      <w:r>
-        <w:t xml:space="preserve"> </w:t>
-      </w:r>
-      <w:proofErr w:type="spellStart"/>
-      <w:r>
-        <w:t>classifier</w:t>
-      </w:r>
-      <w:proofErr w:type="spellEnd"/>
-      <w:r>
-        <w:t xml:space="preserve"> ensemble </w:t>
-      </w:r>
-      <w:proofErr w:type="spellStart"/>
-      <w:r>
-        <w:t>approach</w:t>
-      </w:r>
-      <w:proofErr w:type="spellEnd"/>
-      <w:r>
-        <w:t xml:space="preserve"> </w:t>
-      </w:r>
-      <w:proofErr w:type="spellStart"/>
-      <w:r>
-        <w:t>for</w:t>
-      </w:r>
-      <w:proofErr w:type="spellEnd"/>
-      <w:r>
-        <w:t xml:space="preserve"> </w:t>
-      </w:r>
-      <w:proofErr w:type="spellStart"/>
-      <w:r>
-        <w:t>anomaly</w:t>
-      </w:r>
-      <w:proofErr w:type="spellEnd"/>
-      <w:r>
-        <w:t xml:space="preserve"> </w:t>
-      </w:r>
-      <w:proofErr w:type="spellStart"/>
-      <w:r>
-        <w:t>detection</w:t>
-      </w:r>
-      <w:proofErr w:type="spellEnd"/>
-      <w:r>
-        <w:t xml:space="preserve"> in web </w:t>
-      </w:r>
-      <w:proofErr w:type="spellStart"/>
-      <w:r>
-        <w:t>traffic</w:t>
-      </w:r>
-      <w:proofErr w:type="spellEnd"/>
-      <w:r>
-        <w:t xml:space="preserve">. In 2015 23rd </w:t>
-      </w:r>
-      <w:proofErr w:type="spellStart"/>
-      <w:r>
-        <w:t>Iranian</w:t>
-      </w:r>
-      <w:proofErr w:type="spellEnd"/>
-      <w:r>
-        <w:t xml:space="preserve"> </w:t>
-      </w:r>
-      <w:proofErr w:type="spellStart"/>
-      <w:r>
-        <w:t>Conference</w:t>
-      </w:r>
-      <w:proofErr w:type="spellEnd"/>
-      <w:r>
-        <w:t xml:space="preserve"> </w:t>
-      </w:r>
-      <w:proofErr w:type="spellStart"/>
-      <w:r>
-        <w:t>on</w:t>
-      </w:r>
-      <w:proofErr w:type="spellEnd"/>
-      <w:r>
-        <w:t xml:space="preserve"> </w:t>
-      </w:r>
-      <w:proofErr w:type="spellStart"/>
-      <w:r>
-        <w:t>Electrical</w:t>
-      </w:r>
-      <w:proofErr w:type="spellEnd"/>
-      <w:r>
-        <w:t xml:space="preserve"> </w:t>
-      </w:r>
-      <w:proofErr w:type="spellStart"/>
-      <w:r>
-        <w:t>Engineering</w:t>
-      </w:r>
-      <w:proofErr w:type="spellEnd"/>
-      <w:r>
-        <w:t xml:space="preserve"> (ICEE). IEEE, 2015. 1</w:t>
-      </w:r>
-    </w:p>
-    <w:p>
-      <w:pPr>
-        <w:pStyle w:val="NormalWeb"/>
-        <w:jc w:val="both"/>
-      </w:pPr>
-      <w:r>
-        <w:t xml:space="preserve">[RBMP24] Amanda Riverol, Gustavo </w:t>
-      </w:r>
-      <w:proofErr w:type="spellStart"/>
-      <w:r>
-        <w:t>Betarte</w:t>
-      </w:r>
-      <w:proofErr w:type="spellEnd"/>
-      <w:r>
-        <w:t xml:space="preserve">, Rodrigo Martínez, and Álvaro Pardo. </w:t>
-      </w:r>
-      <w:proofErr w:type="spellStart"/>
-      <w:r>
-        <w:t>Capturing</w:t>
-      </w:r>
-      <w:proofErr w:type="spellEnd"/>
-      <w:r>
-        <w:t xml:space="preserve"> </w:t>
-      </w:r>
-      <w:proofErr w:type="spellStart"/>
-      <w:r>
-        <w:t>the</w:t>
-      </w:r>
-      <w:proofErr w:type="spellEnd"/>
-      <w:r>
-        <w:t xml:space="preserve"> </w:t>
-      </w:r>
-      <w:proofErr w:type="spellStart"/>
-      <w:r>
-        <w:t>security</w:t>
-      </w:r>
-      <w:proofErr w:type="spellEnd"/>
-      <w:r>
-        <w:t xml:space="preserve"> </w:t>
-      </w:r>
-      <w:proofErr w:type="spellStart"/>
-      <w:r>
-        <w:t>expert</w:t>
-      </w:r>
-      <w:proofErr w:type="spellEnd"/>
-      <w:r>
-        <w:t xml:space="preserve"> </w:t>
-      </w:r>
-      <w:proofErr w:type="spellStart"/>
-      <w:r>
-        <w:t>knowledge</w:t>
-      </w:r>
-      <w:proofErr w:type="spellEnd"/>
-      <w:r>
-        <w:t xml:space="preserve"> in </w:t>
-      </w:r>
-      <w:proofErr w:type="spellStart"/>
-      <w:r>
-        <w:t>feature</w:t>
-      </w:r>
-      <w:proofErr w:type="spellEnd"/>
-      <w:r>
-        <w:t xml:space="preserve"> </w:t>
-      </w:r>
-      <w:proofErr w:type="spellStart"/>
-      <w:r>
-        <w:t>selection</w:t>
-      </w:r>
-      <w:proofErr w:type="spellEnd"/>
-      <w:r>
-        <w:t xml:space="preserve"> </w:t>
-      </w:r>
-      <w:proofErr w:type="spellStart"/>
-      <w:r>
-        <w:t>for</w:t>
-      </w:r>
-      <w:proofErr w:type="spellEnd"/>
-      <w:r>
-        <w:t xml:space="preserve"> web </w:t>
-      </w:r>
-      <w:proofErr w:type="spellStart"/>
-      <w:r>
-        <w:t>application</w:t>
-      </w:r>
-      <w:proofErr w:type="spellEnd"/>
-      <w:r>
-        <w:t xml:space="preserve"> </w:t>
-      </w:r>
-      <w:proofErr w:type="spellStart"/>
-      <w:r>
-        <w:t>attack</w:t>
-      </w:r>
-      <w:proofErr w:type="spellEnd"/>
-      <w:r>
-        <w:t xml:space="preserve"> </w:t>
-      </w:r>
-      <w:proofErr w:type="spellStart"/>
-      <w:r>
-        <w:t>detection</w:t>
-      </w:r>
-      <w:proofErr w:type="spellEnd"/>
-      <w:r>
-        <w:t xml:space="preserve">. In </w:t>
-      </w:r>
-      <w:proofErr w:type="spellStart"/>
-      <w:r>
-        <w:t>Proceedings</w:t>
-      </w:r>
-      <w:proofErr w:type="spellEnd"/>
-      <w:r>
-        <w:t xml:space="preserve"> </w:t>
-      </w:r>
-      <w:proofErr w:type="spellStart"/>
-      <w:r>
-        <w:t>of</w:t>
-      </w:r>
-      <w:proofErr w:type="spellEnd"/>
-      <w:r>
-        <w:t xml:space="preserve"> </w:t>
-      </w:r>
-      <w:proofErr w:type="spellStart"/>
-      <w:r>
-        <w:t>the</w:t>
-      </w:r>
-      <w:proofErr w:type="spellEnd"/>
-      <w:r>
-        <w:t xml:space="preserve"> </w:t>
-      </w:r>
-      <w:proofErr w:type="spellStart"/>
-      <w:r>
-        <w:t>Latin</w:t>
-      </w:r>
-      <w:proofErr w:type="spellEnd"/>
-      <w:r>
-        <w:t xml:space="preserve">-American </w:t>
-      </w:r>
-      <w:proofErr w:type="spellStart"/>
-      <w:r>
-        <w:t>Symposium</w:t>
-      </w:r>
-      <w:proofErr w:type="spellEnd"/>
-      <w:r>
-        <w:t xml:space="preserve"> </w:t>
-      </w:r>
-      <w:proofErr w:type="spellStart"/>
-      <w:r>
-        <w:t>on</w:t>
-      </w:r>
-      <w:proofErr w:type="spellEnd"/>
-      <w:r>
-        <w:t xml:space="preserve"> </w:t>
-      </w:r>
-      <w:proofErr w:type="spellStart"/>
-      <w:r>
-        <w:t>Dependable</w:t>
-      </w:r>
-      <w:proofErr w:type="spellEnd"/>
-      <w:r>
-        <w:t xml:space="preserve"> Computing (LADC 2024), </w:t>
-      </w:r>
-      <w:proofErr w:type="spellStart"/>
-      <w:r>
-        <w:t>pages</w:t>
-      </w:r>
-      <w:proofErr w:type="spellEnd"/>
-      <w:r>
-        <w:t xml:space="preserve"> 153–158, 2024. </w:t>
-      </w:r>
-      <w:proofErr w:type="spellStart"/>
-      <w:r>
-        <w:t>Preprint</w:t>
-      </w:r>
-      <w:proofErr w:type="spellEnd"/>
-      <w:r>
-        <w:t xml:space="preserve"> disponible también como arXiv:2407.18445.</w:t>
-      </w:r>
-    </w:p>
-    <w:p>
-      <w:pPr>
-        <w:pStyle w:val="NormalWeb"/>
-        <w:jc w:val="both"/>
-      </w:pPr>
-      <w:r>
-        <w:t xml:space="preserve">[SRBHBH+22] Tomás Sureda Riera, Juan Ramón Bermejo Higuera, Javier Bermejo-Higuera, José Javier Martínez </w:t>
-      </w:r>
-      <w:proofErr w:type="spellStart"/>
-      <w:r>
-        <w:t>Herraiz</w:t>
-      </w:r>
-      <w:proofErr w:type="spellEnd"/>
-      <w:r>
-        <w:t xml:space="preserve">, and Juan Antonio Sicilia. A new </w:t>
-      </w:r>
-      <w:proofErr w:type="spellStart"/>
-      <w:r>
-        <w:t>multi-label</w:t>
-      </w:r>
-      <w:proofErr w:type="spellEnd"/>
-      <w:r>
-        <w:t xml:space="preserve"> </w:t>
-      </w:r>
-      <w:proofErr w:type="spellStart"/>
-      <w:r>
-        <w:t>dataset</w:t>
-      </w:r>
-      <w:proofErr w:type="spellEnd"/>
-      <w:r>
-        <w:t xml:space="preserve"> </w:t>
-      </w:r>
-      <w:proofErr w:type="spellStart"/>
-      <w:r>
-        <w:t>for</w:t>
-      </w:r>
-      <w:proofErr w:type="spellEnd"/>
-      <w:r>
-        <w:t xml:space="preserve"> web </w:t>
-      </w:r>
-      <w:proofErr w:type="spellStart"/>
-      <w:r>
-        <w:t>attacks</w:t>
-      </w:r>
-      <w:proofErr w:type="spellEnd"/>
-      <w:r>
-        <w:t xml:space="preserve"> CAPEC </w:t>
-      </w:r>
-      <w:proofErr w:type="spellStart"/>
-      <w:r>
-        <w:t>classification</w:t>
-      </w:r>
-      <w:proofErr w:type="spellEnd"/>
-      <w:r>
-        <w:t xml:space="preserve"> </w:t>
-      </w:r>
-      <w:proofErr w:type="spellStart"/>
-      <w:r>
-        <w:t>using</w:t>
-      </w:r>
-      <w:proofErr w:type="spellEnd"/>
-      <w:r>
-        <w:t xml:space="preserve"> machine </w:t>
-      </w:r>
-      <w:proofErr w:type="spellStart"/>
-      <w:r>
-        <w:t>learning</w:t>
-      </w:r>
-      <w:proofErr w:type="spellEnd"/>
-      <w:r>
-        <w:t xml:space="preserve"> </w:t>
-      </w:r>
-      <w:proofErr w:type="spellStart"/>
-      <w:r>
-        <w:t>techniques</w:t>
-      </w:r>
-      <w:proofErr w:type="spellEnd"/>
-      <w:r>
-        <w:t xml:space="preserve">. </w:t>
-      </w:r>
-      <w:proofErr w:type="spellStart"/>
-      <w:r>
-        <w:t>Computers</w:t>
-      </w:r>
-      <w:proofErr w:type="spellEnd"/>
-      <w:r>
-        <w:t xml:space="preserve"> &amp; Security, 120:102788, 2022.</w:t>
-      </w:r>
-    </w:p>
-    <w:p>
-      <w:pPr>
-        <w:pStyle w:val="NormalWeb"/>
-        <w:jc w:val="both"/>
-      </w:pPr>
-      <w:r>
-        <w:t xml:space="preserve">[ZZC+24] </w:t>
-      </w:r>
-      <w:proofErr w:type="spellStart"/>
-      <w:r>
-        <w:t>Yonghang</w:t>
-      </w:r>
-      <w:proofErr w:type="spellEnd"/>
-      <w:r>
-        <w:t xml:space="preserve"> Zhou, </w:t>
-      </w:r>
-      <w:proofErr w:type="spellStart"/>
-      <w:r>
-        <w:t>Hongyi</w:t>
-      </w:r>
-      <w:proofErr w:type="spellEnd"/>
-      <w:r>
-        <w:t xml:space="preserve"> Zhu, </w:t>
-      </w:r>
-      <w:proofErr w:type="spellStart"/>
-      <w:r>
-        <w:t>Yidong</w:t>
-      </w:r>
-      <w:proofErr w:type="spellEnd"/>
-      <w:r>
-        <w:t xml:space="preserve"> Chai, </w:t>
-      </w:r>
-      <w:proofErr w:type="spellStart"/>
-      <w:r>
-        <w:t>Yuanchun</w:t>
-      </w:r>
-      <w:proofErr w:type="spellEnd"/>
-      <w:r>
-        <w:t xml:space="preserve"> </w:t>
-      </w:r>
-      <w:proofErr w:type="spellStart"/>
-      <w:r>
-        <w:t>Jiang</w:t>
-      </w:r>
-      <w:proofErr w:type="spellEnd"/>
-      <w:r>
-        <w:t xml:space="preserve">, and </w:t>
-      </w:r>
-      <w:proofErr w:type="spellStart"/>
-      <w:r>
-        <w:t>Yezheng</w:t>
-      </w:r>
-      <w:proofErr w:type="spellEnd"/>
-      <w:r>
-        <w:t xml:space="preserve"> Liu. </w:t>
-      </w:r>
-      <w:proofErr w:type="spellStart"/>
-      <w:r>
-        <w:t>Towards</w:t>
-      </w:r>
-      <w:proofErr w:type="spellEnd"/>
-      <w:r>
-        <w:t xml:space="preserve"> </w:t>
-      </w:r>
-      <w:proofErr w:type="spellStart"/>
-      <w:r>
-        <w:t>trustworthy</w:t>
-      </w:r>
-      <w:proofErr w:type="spellEnd"/>
-      <w:r>
-        <w:t xml:space="preserve"> web </w:t>
-      </w:r>
-      <w:proofErr w:type="spellStart"/>
-      <w:r>
-        <w:t>attack</w:t>
-      </w:r>
-      <w:proofErr w:type="spellEnd"/>
-      <w:r>
-        <w:t xml:space="preserve"> </w:t>
-      </w:r>
-      <w:proofErr w:type="spellStart"/>
-      <w:r>
-        <w:t>detection</w:t>
-      </w:r>
-      <w:proofErr w:type="spellEnd"/>
-      <w:r>
-        <w:t xml:space="preserve">: </w:t>
-      </w:r>
-      <w:proofErr w:type="spellStart"/>
-      <w:r>
-        <w:t>An</w:t>
-      </w:r>
-      <w:proofErr w:type="spellEnd"/>
-      <w:r>
-        <w:t xml:space="preserve"> </w:t>
-      </w:r>
-      <w:proofErr w:type="spellStart"/>
-      <w:r>
-        <w:t>uncertainty-aware</w:t>
-      </w:r>
-      <w:proofErr w:type="spellEnd"/>
-      <w:r>
-        <w:t xml:space="preserve"> ensemble </w:t>
-      </w:r>
-      <w:proofErr w:type="spellStart"/>
-      <w:r>
-        <w:t>deep</w:t>
-      </w:r>
-      <w:proofErr w:type="spellEnd"/>
-      <w:r>
-        <w:t xml:space="preserve"> </w:t>
-      </w:r>
-      <w:proofErr w:type="spellStart"/>
-      <w:r>
-        <w:t>kernel</w:t>
-      </w:r>
-      <w:proofErr w:type="spellEnd"/>
-      <w:r>
-        <w:t xml:space="preserve"> </w:t>
-      </w:r>
-      <w:proofErr w:type="spellStart"/>
-      <w:r>
-        <w:t>learning</w:t>
-      </w:r>
-      <w:proofErr w:type="spellEnd"/>
-      <w:r>
-        <w:t xml:space="preserve"> </w:t>
-      </w:r>
-      <w:proofErr w:type="spellStart"/>
-      <w:r>
-        <w:t>model</w:t>
-      </w:r>
-      <w:proofErr w:type="spellEnd"/>
-      <w:r>
-        <w:t xml:space="preserve">. </w:t>
-      </w:r>
-      <w:hyperlink r:id="rId9" w:tgtFrame="_new" w:history="1">
-        <w:r>
-          <w:rPr>
-            <w:rStyle w:val="Hipervnculo"/>
-          </w:rPr>
-          <w:t>https://arxiv.org/abs/2410.07725</w:t>
-        </w:r>
-      </w:hyperlink>
-      <w:r>
-        <w:t xml:space="preserve">, 2024. </w:t>
-      </w:r>
-      <w:proofErr w:type="spellStart"/>
-      <w:r>
-        <w:t>Preprint</w:t>
-      </w:r>
-      <w:proofErr w:type="spellEnd"/>
-      <w:r>
-        <w:t xml:space="preserve">, experimentos sobre los </w:t>
-      </w:r>
-      <w:proofErr w:type="spellStart"/>
-      <w:r>
-        <w:t>datasets</w:t>
-      </w:r>
-      <w:proofErr w:type="spellEnd"/>
-      <w:r>
-        <w:t xml:space="preserve"> BDCI y SR-BH 2020.</w:t>
+        <w:rPr>
+          <w:rFonts w:ascii="Arial" w:hAnsi="Arial" w:cs="Arial"/>
+        </w:rPr>
+      </w:pPr>
+      <w:r>
+        <w:rPr>
+          <w:rFonts w:ascii="Arial" w:hAnsi="Arial" w:cs="Arial"/>
+        </w:rPr>
+        <w:t>[11] Yonghang Zhou, Hongyi Zhu, Yidong Chai, Yuanchun Jiang, and Yezheng Liu. Towards trustworthy web attack detection: An uncertainty-aware ensemble deep kernel learning model. , 2024. Preprint, experimentos sobre los datasets BDCI y SR-BH 2020.</w:t>
       </w:r>
     </w:p>
     <w:p>
@@ -5614,7 +3883,7 @@
       </w:pPr>
     </w:p>
     <w:sectPr>
-      <w:footerReference w:type="default" r:id="rId10"/>
+      <w:footerReference w:type="default" r:id="rId8"/>
       <w:pgSz w:w="11906" w:h="16838"/>
       <w:pgMar w:top="1417" w:right="1701" w:bottom="1417" w:left="1701" w:header="708" w:footer="708" w:gutter="0"/>
       <w:cols w:space="708"/>
@@ -5659,6 +3928,7 @@
         <w:docPartUnique/>
       </w:docPartObj>
     </w:sdtPr>
+    <w:sdtEndPr/>
     <w:sdtContent>
       <w:p>
         <w:pPr>
@@ -7062,6 +5332,7 @@
   <w:style w:type="character" w:default="1" w:styleId="Fuentedeprrafopredeter">
     <w:name w:val="Default Paragraph Font"/>
     <w:uiPriority w:val="1"/>
+    <w:semiHidden/>
     <w:unhideWhenUsed/>
   </w:style>
   <w:style w:type="table" w:default="1" w:styleId="Tablanormal">

</xml_diff>